<commit_message>
Deleting the old results as i decided to redo all again for the experiment
</commit_message>
<xml_diff>
--- a/Report.docx
+++ b/Report.docx
@@ -62,6 +62,257 @@
     <w:p>
       <w:pPr>
         <w:rPr>
+          <w:rFonts w:eastAsia="DengXian"/>
+          <w:szCs w:val="24"/>
+          <w:lang w:eastAsia="zh-CN"/>
+        </w:rPr>
+      </w:pPr>
+      <w:r>
+        <w:rPr>
+          <w:rFonts w:eastAsia="DengXian"/>
+          <w:szCs w:val="24"/>
+          <w:lang w:eastAsia="zh-CN"/>
+        </w:rPr>
+        <w:t>In this project, a Deep Q-Network (DQN) agent was implemented to solve the LunarLander-v3 environment using Gymnasium. The agent consists of a neural network with two hidden layers of 128 neurons each, combined with experience replay, epsilon-greedy exploration, and a target network for stable training.</w:t>
+      </w:r>
+    </w:p>
+    <w:p>
+      <w:pPr>
+        <w:rPr>
+          <w:rFonts w:eastAsia="DengXian"/>
+          <w:szCs w:val="24"/>
+          <w:lang w:eastAsia="zh-CN"/>
+        </w:rPr>
+      </w:pPr>
+      <w:r>
+        <w:rPr>
+          <w:rFonts w:eastAsia="DengXian"/>
+          <w:szCs w:val="24"/>
+          <w:lang w:eastAsia="zh-CN"/>
+        </w:rPr>
+        <w:t>To investigate the effect of hyperparameter settings, three experiments were conducted. The purpose was to compare how epsilon decay and target network update frequency influence learning performance and policy stability.</w:t>
+      </w:r>
+    </w:p>
+    <w:p>
+      <w:pPr>
+        <w:rPr>
+          <w:rFonts w:eastAsia="DengXian"/>
+          <w:szCs w:val="24"/>
+          <w:lang w:eastAsia="zh-CN"/>
+        </w:rPr>
+      </w:pPr>
+      <w:r>
+        <w:rPr>
+          <w:rFonts w:eastAsia="DengXian"/>
+          <w:szCs w:val="24"/>
+          <w:lang w:eastAsia="zh-CN"/>
+        </w:rPr>
+        <w:t>The baseline configuration used</w:t>
+      </w:r>
+      <w:r>
+        <w:rPr>
+          <w:rFonts w:eastAsia="DengXian" w:hint="eastAsia"/>
+          <w:szCs w:val="24"/>
+          <w:lang w:eastAsia="zh-CN"/>
+        </w:rPr>
+        <w:t>:</w:t>
+      </w:r>
+    </w:p>
+    <w:p>
+      <w:pPr>
+        <w:pStyle w:val="a9"/>
+        <w:numPr>
+          <w:ilvl w:val="0"/>
+          <w:numId w:val="1"/>
+        </w:numPr>
+        <w:rPr>
+          <w:rFonts w:eastAsia="DengXian"/>
+          <w:szCs w:val="24"/>
+          <w:lang w:eastAsia="zh-CN"/>
+        </w:rPr>
+      </w:pPr>
+      <w:r>
+        <w:rPr>
+          <w:rFonts w:eastAsia="DengXian"/>
+          <w:szCs w:val="24"/>
+          <w:lang w:eastAsia="zh-CN"/>
+        </w:rPr>
+        <w:t>learning rate of 5e-4</w:t>
+      </w:r>
+    </w:p>
+    <w:p>
+      <w:pPr>
+        <w:pStyle w:val="a9"/>
+        <w:numPr>
+          <w:ilvl w:val="0"/>
+          <w:numId w:val="1"/>
+        </w:numPr>
+        <w:rPr>
+          <w:rFonts w:eastAsia="DengXian"/>
+          <w:szCs w:val="24"/>
+          <w:lang w:eastAsia="zh-CN"/>
+        </w:rPr>
+      </w:pPr>
+      <w:r>
+        <w:rPr>
+          <w:rFonts w:eastAsia="DengXian"/>
+          <w:szCs w:val="24"/>
+          <w:lang w:eastAsia="zh-CN"/>
+        </w:rPr>
+        <w:t>batch size of 64</w:t>
+      </w:r>
+    </w:p>
+    <w:p>
+      <w:pPr>
+        <w:pStyle w:val="a9"/>
+        <w:numPr>
+          <w:ilvl w:val="0"/>
+          <w:numId w:val="1"/>
+        </w:numPr>
+        <w:rPr>
+          <w:rFonts w:eastAsia="DengXian"/>
+          <w:szCs w:val="24"/>
+          <w:lang w:eastAsia="zh-CN"/>
+        </w:rPr>
+      </w:pPr>
+      <w:r>
+        <w:rPr>
+          <w:rFonts w:eastAsia="DengXian"/>
+          <w:szCs w:val="24"/>
+          <w:lang w:eastAsia="zh-CN"/>
+        </w:rPr>
+        <w:t>replay buffer size of 50000</w:t>
+      </w:r>
+    </w:p>
+    <w:p>
+      <w:pPr>
+        <w:pStyle w:val="a9"/>
+        <w:numPr>
+          <w:ilvl w:val="0"/>
+          <w:numId w:val="1"/>
+        </w:numPr>
+        <w:rPr>
+          <w:rFonts w:eastAsia="DengXian"/>
+          <w:szCs w:val="24"/>
+          <w:lang w:eastAsia="zh-CN"/>
+        </w:rPr>
+      </w:pPr>
+      <w:r>
+        <w:rPr>
+          <w:rFonts w:eastAsia="DengXian"/>
+          <w:szCs w:val="24"/>
+          <w:lang w:eastAsia="zh-CN"/>
+        </w:rPr>
+        <w:t>discount factor of 0.99</w:t>
+      </w:r>
+    </w:p>
+    <w:p>
+      <w:pPr>
+        <w:pStyle w:val="a9"/>
+        <w:numPr>
+          <w:ilvl w:val="0"/>
+          <w:numId w:val="1"/>
+        </w:numPr>
+        <w:rPr>
+          <w:rFonts w:eastAsia="DengXian"/>
+          <w:szCs w:val="24"/>
+          <w:lang w:eastAsia="zh-CN"/>
+        </w:rPr>
+      </w:pPr>
+      <w:r>
+        <w:rPr>
+          <w:rFonts w:eastAsia="DengXian"/>
+          <w:szCs w:val="24"/>
+          <w:lang w:eastAsia="zh-CN"/>
+        </w:rPr>
+        <w:t>epsilon starting at 1.0, and epsilon ending at 0.01.</w:t>
+      </w:r>
+    </w:p>
+    <w:p>
+      <w:pPr>
+        <w:pStyle w:val="a9"/>
+        <w:numPr>
+          <w:ilvl w:val="0"/>
+          <w:numId w:val="1"/>
+        </w:numPr>
+        <w:rPr>
+          <w:rFonts w:eastAsia="DengXian"/>
+          <w:szCs w:val="24"/>
+          <w:lang w:eastAsia="zh-CN"/>
+        </w:rPr>
+      </w:pPr>
+      <w:r>
+        <w:rPr>
+          <w:rFonts w:eastAsia="DengXian" w:hint="eastAsia"/>
+          <w:szCs w:val="24"/>
+          <w:lang w:eastAsia="zh-CN"/>
+        </w:rPr>
+        <w:t>epsilon decay at 0.997</w:t>
+      </w:r>
+    </w:p>
+    <w:p>
+      <w:pPr>
+        <w:pStyle w:val="a9"/>
+        <w:numPr>
+          <w:ilvl w:val="0"/>
+          <w:numId w:val="1"/>
+        </w:numPr>
+        <w:rPr>
+          <w:rFonts w:eastAsia="DengXian"/>
+          <w:szCs w:val="24"/>
+          <w:lang w:eastAsia="zh-CN"/>
+        </w:rPr>
+      </w:pPr>
+      <w:r>
+        <w:rPr>
+          <w:rFonts w:eastAsia="DengXian" w:hint="eastAsia"/>
+          <w:szCs w:val="24"/>
+          <w:lang w:eastAsia="zh-CN"/>
+        </w:rPr>
+        <w:t xml:space="preserve">target update </w:t>
+      </w:r>
+      <w:r>
+        <w:rPr>
+          <w:rFonts w:eastAsia="DengXian"/>
+          <w:szCs w:val="24"/>
+          <w:lang w:eastAsia="zh-CN"/>
+        </w:rPr>
+        <w:t>frequency</w:t>
+      </w:r>
+      <w:r>
+        <w:rPr>
+          <w:rFonts w:eastAsia="DengXian" w:hint="eastAsia"/>
+          <w:szCs w:val="24"/>
+          <w:lang w:eastAsia="zh-CN"/>
+        </w:rPr>
+        <w:t xml:space="preserve"> at 10</w:t>
+      </w:r>
+    </w:p>
+    <w:p>
+      <w:pPr>
+        <w:pStyle w:val="a9"/>
+        <w:numPr>
+          <w:ilvl w:val="0"/>
+          <w:numId w:val="1"/>
+        </w:numPr>
+        <w:rPr>
+          <w:rFonts w:eastAsia="DengXian" w:hint="eastAsia"/>
+          <w:szCs w:val="24"/>
+          <w:lang w:eastAsia="zh-CN"/>
+        </w:rPr>
+      </w:pPr>
+      <w:r>
+        <w:rPr>
+          <w:rFonts w:eastAsia="DengXian" w:hint="eastAsia"/>
+          <w:szCs w:val="24"/>
+          <w:lang w:eastAsia="zh-CN"/>
+        </w:rPr>
+        <w:t>number of episodes of 2000</w:t>
+      </w:r>
+    </w:p>
+    <w:p>
+      <w:pPr>
+        <w:rPr>
           <w:rFonts w:eastAsia="DengXian" w:hint="eastAsia"/>
           <w:szCs w:val="24"/>
           <w:lang w:eastAsia="zh-CN"/>
@@ -69,6 +320,7 @@
       </w:pPr>
     </w:p>
     <w:sectPr>
+      <w:headerReference w:type="default" r:id="rId7"/>
       <w:pgSz w:w="11906" w:h="16838"/>
       <w:pgMar w:top="1440" w:right="1800" w:bottom="1440" w:left="1800" w:header="851" w:footer="992" w:gutter="0"/>
       <w:cols w:space="425"/>
@@ -76,6 +328,206 @@
     </w:sectPr>
   </w:body>
 </w:document>
+</file>
+
+<file path=word/endnotes.xml><?xml version="1.0" encoding="utf-8"?>
+<w:endnotes xmlns:wpc="http://schemas.microsoft.com/office/word/2010/wordprocessingCanvas" xmlns:cx="http://schemas.microsoft.com/office/drawing/2014/chartex" xmlns:cx1="http://schemas.microsoft.com/office/drawing/2015/9/8/chartex" xmlns:cx2="http://schemas.microsoft.com/office/drawing/2015/10/21/chartex" xmlns:cx3="http://schemas.microsoft.com/office/drawing/2016/5/9/chartex" xmlns:cx4="http://schemas.microsoft.com/office/drawing/2016/5/10/chartex" xmlns:cx5="http://schemas.microsoft.com/office/drawing/2016/5/11/chartex" xmlns:cx6="http://schemas.microsoft.com/office/drawing/2016/5/12/chartex" xmlns:cx7="http://schemas.microsoft.com/office/drawing/2016/5/13/chartex" xmlns:cx8="http://schemas.microsoft.com/office/drawing/2016/5/14/chartex" xmlns:mc="http://schemas.openxmlformats.org/markup-compatibility/2006" xmlns:aink="http://schemas.microsoft.com/office/drawing/2016/ink" xmlns:am3d="http://schemas.microsoft.com/office/drawing/2017/model3d" xmlns:o="urn:schemas-microsoft-com:office:office" xmlns:oel="http://schemas.microsoft.com/office/2019/extlst" xmlns:r="http://schemas.openxmlformats.org/officeDocument/2006/relationships" xmlns:m="http://schemas.openxmlformats.org/officeDocument/2006/math" xmlns:v="urn:schemas-microsoft-com:vml" xmlns:wp14="http://schemas.microsoft.com/office/word/2010/wordprocessingDrawing" xmlns:wp="http://schemas.openxmlformats.org/drawingml/2006/wordprocessingDrawing" xmlns:w10="urn:schemas-microsoft-com:office:word" xmlns:w="http://schemas.openxmlformats.org/wordprocessingml/2006/main" xmlns:w14="http://schemas.microsoft.com/office/word/2010/wordml" xmlns:w15="http://schemas.microsoft.com/office/word/2012/wordml" xmlns:w16cex="http://schemas.microsoft.com/office/word/2018/wordml/cex" xmlns:w16cid="http://schemas.microsoft.com/office/word/2016/wordml/cid" xmlns:w16="http://schemas.microsoft.com/office/word/2018/wordml" xmlns:w16du="http://schemas.microsoft.com/office/word/2023/wordml/word16du" xmlns:w16sdtdh="http://schemas.microsoft.com/office/word/2020/wordml/sdtdatahash" xmlns:w16sdtfl="http://schemas.microsoft.com/office/word/2024/wordml/sdtformatlock" xmlns:w16se="http://schemas.microsoft.com/office/word/2015/wordml/symex" xmlns:wpg="http://schemas.microsoft.com/office/word/2010/wordprocessingGroup" xmlns:wpi="http://schemas.microsoft.com/office/word/2010/wordprocessingInk" xmlns:wne="http://schemas.microsoft.com/office/word/2006/wordml" xmlns:wps="http://schemas.microsoft.com/office/word/2010/wordprocessingShape" mc:Ignorable="w14 w15 w16se w16cid w16 w16cex w16sdtdh w16sdtfl w16du wp14">
+  <w:endnote w:type="separator" w:id="-1">
+    <w:p>
+      <w:pPr>
+        <w:spacing w:after="0" w:line="240" w:lineRule="auto"/>
+      </w:pPr>
+      <w:r>
+        <w:separator/>
+      </w:r>
+    </w:p>
+  </w:endnote>
+  <w:endnote w:type="continuationSeparator" w:id="0">
+    <w:p>
+      <w:pPr>
+        <w:spacing w:after="0" w:line="240" w:lineRule="auto"/>
+      </w:pPr>
+      <w:r>
+        <w:continuationSeparator/>
+      </w:r>
+    </w:p>
+  </w:endnote>
+</w:endnotes>
+</file>
+
+<file path=word/footnotes.xml><?xml version="1.0" encoding="utf-8"?>
+<w:footnotes xmlns:wpc="http://schemas.microsoft.com/office/word/2010/wordprocessingCanvas" xmlns:cx="http://schemas.microsoft.com/office/drawing/2014/chartex" xmlns:cx1="http://schemas.microsoft.com/office/drawing/2015/9/8/chartex" xmlns:cx2="http://schemas.microsoft.com/office/drawing/2015/10/21/chartex" xmlns:cx3="http://schemas.microsoft.com/office/drawing/2016/5/9/chartex" xmlns:cx4="http://schemas.microsoft.com/office/drawing/2016/5/10/chartex" xmlns:cx5="http://schemas.microsoft.com/office/drawing/2016/5/11/chartex" xmlns:cx6="http://schemas.microsoft.com/office/drawing/2016/5/12/chartex" xmlns:cx7="http://schemas.microsoft.com/office/drawing/2016/5/13/chartex" xmlns:cx8="http://schemas.microsoft.com/office/drawing/2016/5/14/chartex" xmlns:mc="http://schemas.openxmlformats.org/markup-compatibility/2006" xmlns:aink="http://schemas.microsoft.com/office/drawing/2016/ink" xmlns:am3d="http://schemas.microsoft.com/office/drawing/2017/model3d" xmlns:o="urn:schemas-microsoft-com:office:office" xmlns:oel="http://schemas.microsoft.com/office/2019/extlst" xmlns:r="http://schemas.openxmlformats.org/officeDocument/2006/relationships" xmlns:m="http://schemas.openxmlformats.org/officeDocument/2006/math" xmlns:v="urn:schemas-microsoft-com:vml" xmlns:wp14="http://schemas.microsoft.com/office/word/2010/wordprocessingDrawing" xmlns:wp="http://schemas.openxmlformats.org/drawingml/2006/wordprocessingDrawing" xmlns:w10="urn:schemas-microsoft-com:office:word" xmlns:w="http://schemas.openxmlformats.org/wordprocessingml/2006/main" xmlns:w14="http://schemas.microsoft.com/office/word/2010/wordml" xmlns:w15="http://schemas.microsoft.com/office/word/2012/wordml" xmlns:w16cex="http://schemas.microsoft.com/office/word/2018/wordml/cex" xmlns:w16cid="http://schemas.microsoft.com/office/word/2016/wordml/cid" xmlns:w16="http://schemas.microsoft.com/office/word/2018/wordml" xmlns:w16du="http://schemas.microsoft.com/office/word/2023/wordml/word16du" xmlns:w16sdtdh="http://schemas.microsoft.com/office/word/2020/wordml/sdtdatahash" xmlns:w16sdtfl="http://schemas.microsoft.com/office/word/2024/wordml/sdtformatlock" xmlns:w16se="http://schemas.microsoft.com/office/word/2015/wordml/symex" xmlns:wpg="http://schemas.microsoft.com/office/word/2010/wordprocessingGroup" xmlns:wpi="http://schemas.microsoft.com/office/word/2010/wordprocessingInk" xmlns:wne="http://schemas.microsoft.com/office/word/2006/wordml" xmlns:wps="http://schemas.microsoft.com/office/word/2010/wordprocessingShape" mc:Ignorable="w14 w15 w16se w16cid w16 w16cex w16sdtdh w16sdtfl w16du wp14">
+  <w:footnote w:type="separator" w:id="-1">
+    <w:p>
+      <w:pPr>
+        <w:spacing w:after="0" w:line="240" w:lineRule="auto"/>
+      </w:pPr>
+      <w:r>
+        <w:separator/>
+      </w:r>
+    </w:p>
+  </w:footnote>
+  <w:footnote w:type="continuationSeparator" w:id="0">
+    <w:p>
+      <w:pPr>
+        <w:spacing w:after="0" w:line="240" w:lineRule="auto"/>
+      </w:pPr>
+      <w:r>
+        <w:continuationSeparator/>
+      </w:r>
+    </w:p>
+  </w:footnote>
+</w:footnotes>
+</file>
+
+<file path=word/header1.xml><?xml version="1.0" encoding="utf-8"?>
+<w:hdr xmlns:wpc="http://schemas.microsoft.com/office/word/2010/wordprocessingCanvas" xmlns:cx="http://schemas.microsoft.com/office/drawing/2014/chartex" xmlns:cx1="http://schemas.microsoft.com/office/drawing/2015/9/8/chartex" xmlns:cx2="http://schemas.microsoft.com/office/drawing/2015/10/21/chartex" xmlns:cx3="http://schemas.microsoft.com/office/drawing/2016/5/9/chartex" xmlns:cx4="http://schemas.microsoft.com/office/drawing/2016/5/10/chartex" xmlns:cx5="http://schemas.microsoft.com/office/drawing/2016/5/11/chartex" xmlns:cx6="http://schemas.microsoft.com/office/drawing/2016/5/12/chartex" xmlns:cx7="http://schemas.microsoft.com/office/drawing/2016/5/13/chartex" xmlns:cx8="http://schemas.microsoft.com/office/drawing/2016/5/14/chartex" xmlns:mc="http://schemas.openxmlformats.org/markup-compatibility/2006" xmlns:aink="http://schemas.microsoft.com/office/drawing/2016/ink" xmlns:am3d="http://schemas.microsoft.com/office/drawing/2017/model3d" xmlns:o="urn:schemas-microsoft-com:office:office" xmlns:oel="http://schemas.microsoft.com/office/2019/extlst" xmlns:r="http://schemas.openxmlformats.org/officeDocument/2006/relationships" xmlns:m="http://schemas.openxmlformats.org/officeDocument/2006/math" xmlns:v="urn:schemas-microsoft-com:vml" xmlns:wp14="http://schemas.microsoft.com/office/word/2010/wordprocessingDrawing" xmlns:wp="http://schemas.openxmlformats.org/drawingml/2006/wordprocessingDrawing" xmlns:w10="urn:schemas-microsoft-com:office:word" xmlns:w="http://schemas.openxmlformats.org/wordprocessingml/2006/main" xmlns:w14="http://schemas.microsoft.com/office/word/2010/wordml" xmlns:w15="http://schemas.microsoft.com/office/word/2012/wordml" xmlns:w16cex="http://schemas.microsoft.com/office/word/2018/wordml/cex" xmlns:w16cid="http://schemas.microsoft.com/office/word/2016/wordml/cid" xmlns:w16="http://schemas.microsoft.com/office/word/2018/wordml" xmlns:w16du="http://schemas.microsoft.com/office/word/2023/wordml/word16du" xmlns:w16sdtdh="http://schemas.microsoft.com/office/word/2020/wordml/sdtdatahash" xmlns:w16sdtfl="http://schemas.microsoft.com/office/word/2024/wordml/sdtformatlock" xmlns:w16se="http://schemas.microsoft.com/office/word/2015/wordml/symex" xmlns:wpg="http://schemas.microsoft.com/office/word/2010/wordprocessingGroup" xmlns:wpi="http://schemas.microsoft.com/office/word/2010/wordprocessingInk" xmlns:wne="http://schemas.microsoft.com/office/word/2006/wordml" xmlns:wps="http://schemas.microsoft.com/office/word/2010/wordprocessingShape" mc:Ignorable="w14 w15 w16se w16cid w16 w16cex w16sdtdh w16sdtfl w16du wp14">
+  <w:p>
+    <w:pPr>
+      <w:pStyle w:val="ae"/>
+      <w:wordWrap w:val="0"/>
+      <w:jc w:val="right"/>
+      <w:rPr>
+        <w:rFonts w:eastAsia="DengXian" w:hint="eastAsia"/>
+        <w:lang w:eastAsia="zh-CN"/>
+      </w:rPr>
+    </w:pPr>
+    <w:r>
+      <w:rPr>
+        <w:rFonts w:eastAsia="DengXian" w:hint="eastAsia"/>
+        <w:lang w:eastAsia="zh-CN"/>
+      </w:rPr>
+      <w:t xml:space="preserve">B113040057 </w:t>
+    </w:r>
+    <w:r>
+      <w:rPr>
+        <w:rFonts w:eastAsia="DengXian" w:hint="eastAsia"/>
+        <w:lang w:eastAsia="zh-CN"/>
+      </w:rPr>
+      <w:t>陳柏賢</w:t>
+    </w:r>
+  </w:p>
+</w:hdr>
+</file>
+
+<file path=word/numbering.xml><?xml version="1.0" encoding="utf-8"?>
+<w:numbering xmlns:wpc="http://schemas.microsoft.com/office/word/2010/wordprocessingCanvas" xmlns:cx="http://schemas.microsoft.com/office/drawing/2014/chartex" xmlns:cx1="http://schemas.microsoft.com/office/drawing/2015/9/8/chartex" xmlns:cx2="http://schemas.microsoft.com/office/drawing/2015/10/21/chartex" xmlns:cx3="http://schemas.microsoft.com/office/drawing/2016/5/9/chartex" xmlns:cx4="http://schemas.microsoft.com/office/drawing/2016/5/10/chartex" xmlns:cx5="http://schemas.microsoft.com/office/drawing/2016/5/11/chartex" xmlns:cx6="http://schemas.microsoft.com/office/drawing/2016/5/12/chartex" xmlns:cx7="http://schemas.microsoft.com/office/drawing/2016/5/13/chartex" xmlns:cx8="http://schemas.microsoft.com/office/drawing/2016/5/14/chartex" xmlns:mc="http://schemas.openxmlformats.org/markup-compatibility/2006" xmlns:aink="http://schemas.microsoft.com/office/drawing/2016/ink" xmlns:am3d="http://schemas.microsoft.com/office/drawing/2017/model3d" xmlns:o="urn:schemas-microsoft-com:office:office" xmlns:oel="http://schemas.microsoft.com/office/2019/extlst" xmlns:r="http://schemas.openxmlformats.org/officeDocument/2006/relationships" xmlns:m="http://schemas.openxmlformats.org/officeDocument/2006/math" xmlns:v="urn:schemas-microsoft-com:vml" xmlns:wp14="http://schemas.microsoft.com/office/word/2010/wordprocessingDrawing" xmlns:wp="http://schemas.openxmlformats.org/drawingml/2006/wordprocessingDrawing" xmlns:w10="urn:schemas-microsoft-com:office:word" xmlns:w="http://schemas.openxmlformats.org/wordprocessingml/2006/main" xmlns:w14="http://schemas.microsoft.com/office/word/2010/wordml" xmlns:w15="http://schemas.microsoft.com/office/word/2012/wordml" xmlns:w16cex="http://schemas.microsoft.com/office/word/2018/wordml/cex" xmlns:w16cid="http://schemas.microsoft.com/office/word/2016/wordml/cid" xmlns:w16="http://schemas.microsoft.com/office/word/2018/wordml" xmlns:w16du="http://schemas.microsoft.com/office/word/2023/wordml/word16du" xmlns:w16sdtdh="http://schemas.microsoft.com/office/word/2020/wordml/sdtdatahash" xmlns:w16sdtfl="http://schemas.microsoft.com/office/word/2024/wordml/sdtformatlock" xmlns:w16se="http://schemas.microsoft.com/office/word/2015/wordml/symex" xmlns:wpg="http://schemas.microsoft.com/office/word/2010/wordprocessingGroup" xmlns:wpi="http://schemas.microsoft.com/office/word/2010/wordprocessingInk" xmlns:wne="http://schemas.microsoft.com/office/word/2006/wordml" xmlns:wps="http://schemas.microsoft.com/office/word/2010/wordprocessingShape" mc:Ignorable="w14 w15 w16se w16cid w16 w16cex w16sdtdh w16sdtfl w16du wp14">
+  <w:abstractNum w:abstractNumId="0" w15:restartNumberingAfterBreak="0">
+    <w:nsid w:val="0FCB07CC"/>
+    <w:multiLevelType w:val="hybridMultilevel"/>
+    <w:tmpl w:val="D730DB64"/>
+    <w:lvl w:ilvl="0" w:tplc="152EF3BA">
+      <w:numFmt w:val="bullet"/>
+      <w:lvlText w:val="-"/>
+      <w:lvlJc w:val="left"/>
+      <w:pPr>
+        <w:ind w:left="360" w:hanging="360"/>
+      </w:pPr>
+      <w:rPr>
+        <w:rFonts w:ascii="Times New Roman" w:eastAsia="DengXian" w:hAnsi="Times New Roman" w:cs="Times New Roman" w:hint="default"/>
+      </w:rPr>
+    </w:lvl>
+    <w:lvl w:ilvl="1" w:tplc="04090003" w:tentative="1">
+      <w:start w:val="1"/>
+      <w:numFmt w:val="bullet"/>
+      <w:lvlText w:val=""/>
+      <w:lvlJc w:val="left"/>
+      <w:pPr>
+        <w:ind w:left="960" w:hanging="480"/>
+      </w:pPr>
+      <w:rPr>
+        <w:rFonts w:ascii="Wingdings" w:hAnsi="Wingdings" w:hint="default"/>
+      </w:rPr>
+    </w:lvl>
+    <w:lvl w:ilvl="2" w:tplc="04090005" w:tentative="1">
+      <w:start w:val="1"/>
+      <w:numFmt w:val="bullet"/>
+      <w:lvlText w:val=""/>
+      <w:lvlJc w:val="left"/>
+      <w:pPr>
+        <w:ind w:left="1440" w:hanging="480"/>
+      </w:pPr>
+      <w:rPr>
+        <w:rFonts w:ascii="Wingdings" w:hAnsi="Wingdings" w:hint="default"/>
+      </w:rPr>
+    </w:lvl>
+    <w:lvl w:ilvl="3" w:tplc="04090001" w:tentative="1">
+      <w:start w:val="1"/>
+      <w:numFmt w:val="bullet"/>
+      <w:lvlText w:val=""/>
+      <w:lvlJc w:val="left"/>
+      <w:pPr>
+        <w:ind w:left="1920" w:hanging="480"/>
+      </w:pPr>
+      <w:rPr>
+        <w:rFonts w:ascii="Wingdings" w:hAnsi="Wingdings" w:hint="default"/>
+      </w:rPr>
+    </w:lvl>
+    <w:lvl w:ilvl="4" w:tplc="04090003" w:tentative="1">
+      <w:start w:val="1"/>
+      <w:numFmt w:val="bullet"/>
+      <w:lvlText w:val=""/>
+      <w:lvlJc w:val="left"/>
+      <w:pPr>
+        <w:ind w:left="2400" w:hanging="480"/>
+      </w:pPr>
+      <w:rPr>
+        <w:rFonts w:ascii="Wingdings" w:hAnsi="Wingdings" w:hint="default"/>
+      </w:rPr>
+    </w:lvl>
+    <w:lvl w:ilvl="5" w:tplc="04090005" w:tentative="1">
+      <w:start w:val="1"/>
+      <w:numFmt w:val="bullet"/>
+      <w:lvlText w:val=""/>
+      <w:lvlJc w:val="left"/>
+      <w:pPr>
+        <w:ind w:left="2880" w:hanging="480"/>
+      </w:pPr>
+      <w:rPr>
+        <w:rFonts w:ascii="Wingdings" w:hAnsi="Wingdings" w:hint="default"/>
+      </w:rPr>
+    </w:lvl>
+    <w:lvl w:ilvl="6" w:tplc="04090001" w:tentative="1">
+      <w:start w:val="1"/>
+      <w:numFmt w:val="bullet"/>
+      <w:lvlText w:val=""/>
+      <w:lvlJc w:val="left"/>
+      <w:pPr>
+        <w:ind w:left="3360" w:hanging="480"/>
+      </w:pPr>
+      <w:rPr>
+        <w:rFonts w:ascii="Wingdings" w:hAnsi="Wingdings" w:hint="default"/>
+      </w:rPr>
+    </w:lvl>
+    <w:lvl w:ilvl="7" w:tplc="04090003" w:tentative="1">
+      <w:start w:val="1"/>
+      <w:numFmt w:val="bullet"/>
+      <w:lvlText w:val=""/>
+      <w:lvlJc w:val="left"/>
+      <w:pPr>
+        <w:ind w:left="3840" w:hanging="480"/>
+      </w:pPr>
+      <w:rPr>
+        <w:rFonts w:ascii="Wingdings" w:hAnsi="Wingdings" w:hint="default"/>
+      </w:rPr>
+    </w:lvl>
+    <w:lvl w:ilvl="8" w:tplc="04090005" w:tentative="1">
+      <w:start w:val="1"/>
+      <w:numFmt w:val="bullet"/>
+      <w:lvlText w:val=""/>
+      <w:lvlJc w:val="left"/>
+      <w:pPr>
+        <w:ind w:left="4320" w:hanging="480"/>
+      </w:pPr>
+      <w:rPr>
+        <w:rFonts w:ascii="Wingdings" w:hAnsi="Wingdings" w:hint="default"/>
+      </w:rPr>
+    </w:lvl>
+  </w:abstractNum>
+  <w:num w:numId="1" w16cid:durableId="796148199">
+    <w:abstractNumId w:val="0"/>
+  </w:num>
+</w:numbering>
 </file>
 
 <file path=word/styles.xml><?xml version="1.0" encoding="utf-8"?>
@@ -994,6 +1446,66 @@
       <w:spacing w:val="5"/>
     </w:rPr>
   </w:style>
+  <w:style w:type="paragraph" w:styleId="ae">
+    <w:name w:val="header"/>
+    <w:basedOn w:val="a"/>
+    <w:link w:val="af"/>
+    <w:uiPriority w:val="99"/>
+    <w:unhideWhenUsed/>
+    <w:rsid w:val="00F75E5E"/>
+    <w:pPr>
+      <w:tabs>
+        <w:tab w:val="center" w:pos="4153"/>
+        <w:tab w:val="right" w:pos="8306"/>
+      </w:tabs>
+      <w:snapToGrid w:val="0"/>
+    </w:pPr>
+    <w:rPr>
+      <w:sz w:val="20"/>
+      <w:szCs w:val="20"/>
+    </w:rPr>
+  </w:style>
+  <w:style w:type="character" w:customStyle="1" w:styleId="af">
+    <w:name w:val="頁首 字元"/>
+    <w:basedOn w:val="a0"/>
+    <w:link w:val="ae"/>
+    <w:uiPriority w:val="99"/>
+    <w:rsid w:val="00F75E5E"/>
+    <w:rPr>
+      <w:sz w:val="20"/>
+      <w:szCs w:val="20"/>
+    </w:rPr>
+  </w:style>
+  <w:style w:type="paragraph" w:styleId="af0">
+    <w:name w:val="footer"/>
+    <w:basedOn w:val="a"/>
+    <w:link w:val="af1"/>
+    <w:uiPriority w:val="99"/>
+    <w:unhideWhenUsed/>
+    <w:rsid w:val="00F75E5E"/>
+    <w:pPr>
+      <w:tabs>
+        <w:tab w:val="center" w:pos="4153"/>
+        <w:tab w:val="right" w:pos="8306"/>
+      </w:tabs>
+      <w:snapToGrid w:val="0"/>
+    </w:pPr>
+    <w:rPr>
+      <w:sz w:val="20"/>
+      <w:szCs w:val="20"/>
+    </w:rPr>
+  </w:style>
+  <w:style w:type="character" w:customStyle="1" w:styleId="af1">
+    <w:name w:val="頁尾 字元"/>
+    <w:basedOn w:val="a0"/>
+    <w:link w:val="af0"/>
+    <w:uiPriority w:val="99"/>
+    <w:rsid w:val="00F75E5E"/>
+    <w:rPr>
+      <w:sz w:val="20"/>
+      <w:szCs w:val="20"/>
+    </w:rPr>
+  </w:style>
 </w:styles>
 </file>
 

</xml_diff>

<commit_message>
Uplload some experiment 1 (espisode decay) results
</commit_message>
<xml_diff>
--- a/Report.docx
+++ b/Report.docx
@@ -73,46 +73,79 @@
           <w:szCs w:val="24"/>
           <w:lang w:eastAsia="zh-CN"/>
         </w:rPr>
-        <w:t>In this project, a Deep Q-Network (DQN) agent was implemented to solve the LunarLander-v3 environment using Gymnasium. The agent consists of a neural network with two hidden layers of 128 neurons each, combined with experience replay, epsilon-greedy exploration, and a target network for stable training.</w:t>
-      </w:r>
-    </w:p>
-    <w:p>
-      <w:pPr>
-        <w:rPr>
-          <w:rFonts w:eastAsia="DengXian"/>
-          <w:szCs w:val="24"/>
-          <w:lang w:eastAsia="zh-CN"/>
-        </w:rPr>
-      </w:pPr>
-      <w:r>
-        <w:rPr>
-          <w:rFonts w:eastAsia="DengXian"/>
-          <w:szCs w:val="24"/>
-          <w:lang w:eastAsia="zh-CN"/>
-        </w:rPr>
-        <w:t>To investigate the effect of hyperparameter settings, three experiments were conducted. The purpose was to compare how epsilon decay and target network update frequency influence learning performance and policy stability.</w:t>
-      </w:r>
-    </w:p>
-    <w:p>
-      <w:pPr>
-        <w:rPr>
-          <w:rFonts w:eastAsia="DengXian"/>
-          <w:szCs w:val="24"/>
-          <w:lang w:eastAsia="zh-CN"/>
-        </w:rPr>
-      </w:pPr>
-      <w:r>
-        <w:rPr>
-          <w:rFonts w:eastAsia="DengXian"/>
-          <w:szCs w:val="24"/>
-          <w:lang w:eastAsia="zh-CN"/>
-        </w:rPr>
-        <w:t>The baseline configuration used</w:t>
-      </w:r>
+        <w:t>To study how hyperparameters affect DQN performance in LunarLander-v3, a baseline configuration was first tested using the default values provided by the starter code. Then, three groups of experiments were conducted by changing one hyperparameter at a time while keeping all other settings fixed.</w:t>
+      </w:r>
+    </w:p>
+    <w:p>
+      <w:pPr>
+        <w:rPr>
+          <w:rFonts w:eastAsia="DengXian"/>
+          <w:szCs w:val="24"/>
+          <w:lang w:eastAsia="zh-CN"/>
+        </w:rPr>
+      </w:pPr>
+      <w:r>
+        <w:rPr>
+          <w:rFonts w:eastAsia="DengXian"/>
+          <w:szCs w:val="24"/>
+          <w:lang w:eastAsia="zh-CN"/>
+        </w:rPr>
+        <w:t>The goal was to understand how each hyperparameter influences learning performance, stability, and final policy quality.</w:t>
+      </w:r>
+    </w:p>
+    <w:p>
+      <w:pPr>
+        <w:rPr>
+          <w:rFonts w:eastAsia="DengXian"/>
+          <w:szCs w:val="24"/>
+          <w:lang w:eastAsia="zh-CN"/>
+        </w:rPr>
+      </w:pPr>
+      <w:r>
+        <w:rPr>
+          <w:rFonts w:eastAsia="DengXian"/>
+          <w:szCs w:val="24"/>
+          <w:lang w:eastAsia="zh-CN"/>
+        </w:rPr>
+        <w:t>All experiments used the same random seed (SEED = 42) to ensure fair comparison.</w:t>
+      </w:r>
+    </w:p>
+    <w:p>
+      <w:pPr>
+        <w:rPr>
+          <w:rFonts w:eastAsia="DengXian"/>
+          <w:sz w:val="28"/>
+          <w:szCs w:val="28"/>
+          <w:lang w:eastAsia="zh-CN"/>
+        </w:rPr>
+      </w:pPr>
       <w:r>
         <w:rPr>
           <w:rFonts w:eastAsia="DengXian" w:hint="eastAsia"/>
-          <w:szCs w:val="24"/>
+          <w:b/>
+          <w:bCs/>
+          <w:sz w:val="28"/>
+          <w:szCs w:val="28"/>
+          <w:lang w:eastAsia="zh-CN"/>
+        </w:rPr>
+        <w:t>B</w:t>
+      </w:r>
+      <w:r>
+        <w:rPr>
+          <w:rFonts w:eastAsia="DengXian"/>
+          <w:b/>
+          <w:bCs/>
+          <w:sz w:val="28"/>
+          <w:szCs w:val="28"/>
+          <w:lang w:eastAsia="zh-CN"/>
+        </w:rPr>
+        <w:t>aseline configuration</w:t>
+      </w:r>
+      <w:r>
+        <w:rPr>
+          <w:rFonts w:eastAsia="DengXian" w:hint="eastAsia"/>
+          <w:sz w:val="28"/>
+          <w:szCs w:val="28"/>
           <w:lang w:eastAsia="zh-CN"/>
         </w:rPr>
         <w:t>:</w:t>
@@ -131,13 +164,23 @@
           <w:lang w:eastAsia="zh-CN"/>
         </w:rPr>
       </w:pPr>
-      <w:r>
-        <w:rPr>
-          <w:rFonts w:eastAsia="DengXian"/>
-          <w:szCs w:val="24"/>
-          <w:lang w:eastAsia="zh-CN"/>
-        </w:rPr>
-        <w:t>learning rate of 5e-4</w:t>
+      <w:proofErr w:type="gramStart"/>
+      <w:r>
+        <w:rPr>
+          <w:rFonts w:eastAsia="DengXian"/>
+          <w:szCs w:val="24"/>
+          <w:lang w:eastAsia="zh-CN"/>
+        </w:rPr>
+        <w:t>learning</w:t>
+      </w:r>
+      <w:proofErr w:type="gramEnd"/>
+      <w:r>
+        <w:rPr>
+          <w:rFonts w:eastAsia="DengXian"/>
+          <w:szCs w:val="24"/>
+          <w:lang w:eastAsia="zh-CN"/>
+        </w:rPr>
+        <w:t xml:space="preserve"> rate of 5e-4</w:t>
       </w:r>
     </w:p>
     <w:p>
@@ -181,7 +224,23 @@
           <w:szCs w:val="24"/>
           <w:lang w:eastAsia="zh-CN"/>
         </w:rPr>
-        <w:t>replay buffer size of 50000</w:t>
+        <w:t xml:space="preserve">replay buffer size of </w:t>
+      </w:r>
+      <w:r>
+        <w:rPr>
+          <w:rFonts w:eastAsia="DengXian" w:hint="eastAsia"/>
+          <w:szCs w:val="24"/>
+          <w:lang w:eastAsia="zh-CN"/>
+        </w:rPr>
+        <w:t>1</w:t>
+      </w:r>
+      <w:r>
+        <w:rPr>
+          <w:rFonts w:eastAsia="DengXian"/>
+          <w:szCs w:val="24"/>
+          <w:lang w:eastAsia="zh-CN"/>
+        </w:rPr>
+        <w:t>0000</w:t>
       </w:r>
     </w:p>
     <w:p>
@@ -247,7 +306,15 @@
           <w:szCs w:val="24"/>
           <w:lang w:eastAsia="zh-CN"/>
         </w:rPr>
-        <w:t>epsilon decay at 0.997</w:t>
+        <w:t>epsilon decay at 0.99</w:t>
+      </w:r>
+      <w:r>
+        <w:rPr>
+          <w:rFonts w:eastAsia="DengXian" w:hint="eastAsia"/>
+          <w:szCs w:val="24"/>
+          <w:lang w:eastAsia="zh-CN"/>
+        </w:rPr>
+        <w:t>5</w:t>
       </w:r>
     </w:p>
     <w:p>
@@ -296,28 +363,240 @@
           <w:numId w:val="1"/>
         </w:numPr>
         <w:rPr>
+          <w:rFonts w:eastAsia="DengXian"/>
+          <w:szCs w:val="24"/>
+          <w:lang w:eastAsia="zh-CN"/>
+        </w:rPr>
+      </w:pPr>
+      <w:r>
+        <w:rPr>
           <w:rFonts w:eastAsia="DengXian" w:hint="eastAsia"/>
           <w:szCs w:val="24"/>
           <w:lang w:eastAsia="zh-CN"/>
         </w:rPr>
-      </w:pPr>
+        <w:t>number of episodes of 2000</w:t>
+      </w:r>
+    </w:p>
+    <w:p>
+      <w:pPr>
+        <w:rPr>
+          <w:rFonts w:eastAsia="DengXian"/>
+          <w:szCs w:val="24"/>
+          <w:lang w:eastAsia="zh-CN"/>
+        </w:rPr>
+      </w:pPr>
+      <w:r>
+        <w:rPr>
+          <w:rFonts w:eastAsia="DengXian"/>
+          <w:szCs w:val="24"/>
+          <w:lang w:eastAsia="zh-CN"/>
+        </w:rPr>
+        <w:t>Test Results</w:t>
+      </w:r>
+    </w:p>
+    <w:p>
+      <w:pPr>
+        <w:rPr>
+          <w:rFonts w:eastAsia="DengXian"/>
+          <w:b/>
+          <w:bCs/>
+          <w:szCs w:val="24"/>
+          <w:lang w:eastAsia="zh-CN"/>
+        </w:rPr>
+      </w:pPr>
+      <w:r>
+        <w:rPr>
+          <w:rFonts w:eastAsia="DengXian"/>
+          <w:szCs w:val="24"/>
+          <w:lang w:eastAsia="zh-CN"/>
+        </w:rPr>
+        <w:t xml:space="preserve">Mean test Reward: </w:t>
+      </w:r>
+      <w:r>
+        <w:rPr>
+          <w:rFonts w:eastAsia="DengXian"/>
+          <w:b/>
+          <w:bCs/>
+          <w:szCs w:val="24"/>
+          <w:lang w:eastAsia="zh-CN"/>
+        </w:rPr>
+        <w:t>168.12</w:t>
+      </w:r>
       <w:r>
         <w:rPr>
           <w:rFonts w:eastAsia="DengXian" w:hint="eastAsia"/>
           <w:szCs w:val="24"/>
           <w:lang w:eastAsia="zh-CN"/>
         </w:rPr>
-        <w:t>number of episodes of 2000</w:t>
-      </w:r>
-    </w:p>
-    <w:p>
-      <w:pPr>
+        <w:t xml:space="preserve">, </w:t>
+      </w:r>
+      <w:r>
+        <w:rPr>
+          <w:rFonts w:eastAsia="DengXian"/>
+          <w:szCs w:val="24"/>
+          <w:lang w:eastAsia="zh-CN"/>
+        </w:rPr>
+        <w:t xml:space="preserve">Max Reward: </w:t>
+      </w:r>
+      <w:r>
+        <w:rPr>
+          <w:rFonts w:eastAsia="DengXian"/>
+          <w:b/>
+          <w:bCs/>
+          <w:szCs w:val="24"/>
+          <w:lang w:eastAsia="zh-CN"/>
+        </w:rPr>
+        <w:t>303.01</w:t>
+      </w:r>
+      <w:r>
         <w:rPr>
           <w:rFonts w:eastAsia="DengXian" w:hint="eastAsia"/>
           <w:szCs w:val="24"/>
           <w:lang w:eastAsia="zh-CN"/>
         </w:rPr>
-      </w:pPr>
+        <w:t xml:space="preserve">, </w:t>
+      </w:r>
+      <w:r>
+        <w:rPr>
+          <w:rFonts w:eastAsia="DengXian"/>
+          <w:szCs w:val="24"/>
+          <w:lang w:eastAsia="zh-CN"/>
+        </w:rPr>
+        <w:t xml:space="preserve">Min Reward: </w:t>
+      </w:r>
+      <w:r>
+        <w:rPr>
+          <w:rFonts w:eastAsia="DengXian"/>
+          <w:b/>
+          <w:bCs/>
+          <w:szCs w:val="24"/>
+          <w:lang w:eastAsia="zh-CN"/>
+        </w:rPr>
+        <w:t>-89.86</w:t>
+      </w:r>
+      <w:r>
+        <w:rPr>
+          <w:rFonts w:eastAsia="DengXian" w:hint="eastAsia"/>
+          <w:szCs w:val="24"/>
+          <w:lang w:eastAsia="zh-CN"/>
+        </w:rPr>
+        <w:t xml:space="preserve">, </w:t>
+      </w:r>
+      <w:r>
+        <w:rPr>
+          <w:rFonts w:eastAsia="DengXian"/>
+          <w:szCs w:val="24"/>
+          <w:lang w:eastAsia="zh-CN"/>
+        </w:rPr>
+        <w:t xml:space="preserve">Success Rate: </w:t>
+      </w:r>
+      <w:r>
+        <w:rPr>
+          <w:rFonts w:eastAsia="DengXian"/>
+          <w:b/>
+          <w:bCs/>
+          <w:szCs w:val="24"/>
+          <w:lang w:eastAsia="zh-CN"/>
+        </w:rPr>
+        <w:t>55.0%</w:t>
+      </w:r>
+    </w:p>
+    <w:p>
+      <w:pPr>
+        <w:rPr>
+          <w:rFonts w:eastAsia="DengXian"/>
+          <w:szCs w:val="24"/>
+          <w:lang w:eastAsia="zh-CN"/>
+        </w:rPr>
+      </w:pPr>
+      <w:r>
+        <w:rPr>
+          <w:rFonts w:eastAsia="DengXian"/>
+          <w:szCs w:val="24"/>
+          <w:lang w:eastAsia="zh-CN"/>
+        </w:rPr>
+        <w:t>The baseline model learned some landing behavior, but performance was unstable and inconsistent.</w:t>
+      </w:r>
+    </w:p>
+    <w:p>
+      <w:pPr>
+        <w:rPr>
+          <w:rFonts w:eastAsia="DengXian"/>
+          <w:b/>
+          <w:bCs/>
+          <w:sz w:val="28"/>
+          <w:szCs w:val="28"/>
+          <w:lang w:eastAsia="zh-CN"/>
+        </w:rPr>
+      </w:pPr>
+      <w:r>
+        <w:rPr>
+          <w:rFonts w:eastAsia="DengXian"/>
+          <w:b/>
+          <w:bCs/>
+          <w:sz w:val="28"/>
+          <w:szCs w:val="28"/>
+          <w:lang w:eastAsia="zh-CN"/>
+        </w:rPr>
+        <w:t>Experiment A</w:t>
+      </w:r>
+    </w:p>
+    <w:p>
+      <w:pPr>
+        <w:rPr>
+          <w:rFonts w:eastAsia="DengXian"/>
+          <w:b/>
+          <w:bCs/>
+          <w:sz w:val="28"/>
+          <w:szCs w:val="28"/>
+          <w:lang w:eastAsia="zh-CN"/>
+        </w:rPr>
+      </w:pPr>
+      <w:r>
+        <w:rPr>
+          <w:rFonts w:eastAsia="DengXian"/>
+          <w:b/>
+          <w:bCs/>
+          <w:sz w:val="28"/>
+          <w:szCs w:val="28"/>
+          <w:lang w:eastAsia="zh-CN"/>
+        </w:rPr>
+        <w:t>Experiment B</w:t>
+      </w:r>
+    </w:p>
+    <w:p>
+      <w:pPr>
+        <w:rPr>
+          <w:rFonts w:eastAsia="DengXian" w:hint="eastAsia"/>
+          <w:b/>
+          <w:bCs/>
+          <w:sz w:val="28"/>
+          <w:szCs w:val="28"/>
+          <w:lang w:eastAsia="zh-CN"/>
+        </w:rPr>
+      </w:pPr>
+      <w:r>
+        <w:rPr>
+          <w:rFonts w:eastAsia="DengXian"/>
+          <w:b/>
+          <w:bCs/>
+          <w:sz w:val="28"/>
+          <w:szCs w:val="28"/>
+          <w:lang w:eastAsia="zh-CN"/>
+        </w:rPr>
+        <w:t xml:space="preserve">Experiment </w:t>
+      </w:r>
+      <w:r>
+        <w:rPr>
+          <w:rFonts w:eastAsia="DengXian" w:hint="eastAsia"/>
+          <w:b/>
+          <w:bCs/>
+          <w:sz w:val="28"/>
+          <w:szCs w:val="28"/>
+          <w:lang w:eastAsia="zh-CN"/>
+        </w:rPr>
+        <w:t>C</w:t>
+      </w:r>
     </w:p>
     <w:sectPr>
       <w:headerReference w:type="default" r:id="rId7"/>

</xml_diff>

<commit_message>
Upload the results of experiment A,
</commit_message>
<xml_diff>
--- a/Report.docx
+++ b/Report.docx
@@ -164,23 +164,13 @@
           <w:lang w:eastAsia="zh-CN"/>
         </w:rPr>
       </w:pPr>
-      <w:proofErr w:type="gramStart"/>
-      <w:r>
-        <w:rPr>
-          <w:rFonts w:eastAsia="DengXian"/>
-          <w:szCs w:val="24"/>
-          <w:lang w:eastAsia="zh-CN"/>
-        </w:rPr>
-        <w:t>learning</w:t>
-      </w:r>
-      <w:proofErr w:type="gramEnd"/>
-      <w:r>
-        <w:rPr>
-          <w:rFonts w:eastAsia="DengXian"/>
-          <w:szCs w:val="24"/>
-          <w:lang w:eastAsia="zh-CN"/>
-        </w:rPr>
-        <w:t xml:space="preserve"> rate of 5e-4</w:t>
+      <w:r>
+        <w:rPr>
+          <w:rFonts w:eastAsia="DengXian"/>
+          <w:szCs w:val="24"/>
+          <w:lang w:eastAsia="zh-CN"/>
+        </w:rPr>
+        <w:t>learning rate of 5e-4</w:t>
       </w:r>
     </w:p>
     <w:p>
@@ -540,32 +530,7 @@
         </w:rPr>
         <w:t>Experiment A</w:t>
       </w:r>
-    </w:p>
-    <w:p>
-      <w:pPr>
-        <w:rPr>
-          <w:rFonts w:eastAsia="DengXian"/>
-          <w:b/>
-          <w:bCs/>
-          <w:sz w:val="28"/>
-          <w:szCs w:val="28"/>
-          <w:lang w:eastAsia="zh-CN"/>
-        </w:rPr>
-      </w:pPr>
-      <w:r>
-        <w:rPr>
-          <w:rFonts w:eastAsia="DengXian"/>
-          <w:b/>
-          <w:bCs/>
-          <w:sz w:val="28"/>
-          <w:szCs w:val="28"/>
-          <w:lang w:eastAsia="zh-CN"/>
-        </w:rPr>
-        <w:t>Experiment B</w:t>
-      </w:r>
-    </w:p>
-    <w:p>
-      <w:pPr>
+      <w:r>
         <w:rPr>
           <w:rFonts w:eastAsia="DengXian" w:hint="eastAsia"/>
           <w:b/>
@@ -574,8 +539,918 @@
           <w:szCs w:val="28"/>
           <w:lang w:eastAsia="zh-CN"/>
         </w:rPr>
+        <w:t>: Episode decay</w:t>
+      </w:r>
+    </w:p>
+    <w:tbl>
+      <w:tblPr>
+        <w:tblStyle w:val="af2"/>
+        <w:tblW w:w="0" w:type="auto"/>
+        <w:tblLook w:val="04A0" w:firstRow="1" w:lastRow="0" w:firstColumn="1" w:lastColumn="0" w:noHBand="0" w:noVBand="1"/>
+      </w:tblPr>
+      <w:tblGrid>
+        <w:gridCol w:w="1382"/>
+        <w:gridCol w:w="1382"/>
+        <w:gridCol w:w="1383"/>
+        <w:gridCol w:w="1383"/>
+        <w:gridCol w:w="1383"/>
+      </w:tblGrid>
+      <w:tr>
+        <w:tc>
+          <w:tcPr>
+            <w:tcW w:w="1382" w:type="dxa"/>
+          </w:tcPr>
+          <w:p>
+            <w:pPr>
+              <w:rPr>
+                <w:rFonts w:eastAsia="DengXian" w:hint="eastAsia"/>
+                <w:b/>
+                <w:bCs/>
+                <w:sz w:val="18"/>
+                <w:szCs w:val="18"/>
+                <w:lang w:eastAsia="zh-CN"/>
+              </w:rPr>
+            </w:pPr>
+            <w:r>
+              <w:rPr>
+                <w:rFonts w:eastAsia="DengXian" w:hint="eastAsia"/>
+                <w:b/>
+                <w:bCs/>
+                <w:sz w:val="18"/>
+                <w:szCs w:val="18"/>
+                <w:lang w:eastAsia="zh-CN"/>
+              </w:rPr>
+              <w:t>Episode decay</w:t>
+            </w:r>
+          </w:p>
+        </w:tc>
+        <w:tc>
+          <w:tcPr>
+            <w:tcW w:w="1382" w:type="dxa"/>
+          </w:tcPr>
+          <w:p>
+            <w:pPr>
+              <w:rPr>
+                <w:rFonts w:eastAsia="DengXian" w:hint="eastAsia"/>
+                <w:b/>
+                <w:bCs/>
+                <w:sz w:val="18"/>
+                <w:szCs w:val="18"/>
+                <w:lang w:eastAsia="zh-CN"/>
+              </w:rPr>
+            </w:pPr>
+            <w:r>
+              <w:rPr>
+                <w:rFonts w:eastAsia="DengXian" w:hint="eastAsia"/>
+                <w:b/>
+                <w:bCs/>
+                <w:sz w:val="18"/>
+                <w:szCs w:val="18"/>
+                <w:lang w:eastAsia="zh-CN"/>
+              </w:rPr>
+              <w:t>Mean Reward</w:t>
+            </w:r>
+          </w:p>
+        </w:tc>
+        <w:tc>
+          <w:tcPr>
+            <w:tcW w:w="1383" w:type="dxa"/>
+          </w:tcPr>
+          <w:p>
+            <w:pPr>
+              <w:rPr>
+                <w:rFonts w:eastAsia="DengXian" w:hint="eastAsia"/>
+                <w:b/>
+                <w:bCs/>
+                <w:sz w:val="18"/>
+                <w:szCs w:val="18"/>
+                <w:lang w:eastAsia="zh-CN"/>
+              </w:rPr>
+            </w:pPr>
+            <w:r>
+              <w:rPr>
+                <w:rFonts w:eastAsia="DengXian" w:hint="eastAsia"/>
+                <w:b/>
+                <w:bCs/>
+                <w:sz w:val="18"/>
+                <w:szCs w:val="18"/>
+                <w:lang w:eastAsia="zh-CN"/>
+              </w:rPr>
+              <w:t>Max Reward</w:t>
+            </w:r>
+          </w:p>
+        </w:tc>
+        <w:tc>
+          <w:tcPr>
+            <w:tcW w:w="1383" w:type="dxa"/>
+          </w:tcPr>
+          <w:p>
+            <w:pPr>
+              <w:rPr>
+                <w:rFonts w:eastAsia="DengXian" w:hint="eastAsia"/>
+                <w:b/>
+                <w:bCs/>
+                <w:sz w:val="18"/>
+                <w:szCs w:val="18"/>
+                <w:lang w:eastAsia="zh-CN"/>
+              </w:rPr>
+            </w:pPr>
+            <w:r>
+              <w:rPr>
+                <w:rFonts w:eastAsia="DengXian"/>
+                <w:b/>
+                <w:bCs/>
+                <w:sz w:val="18"/>
+                <w:szCs w:val="18"/>
+                <w:lang w:eastAsia="zh-CN"/>
+              </w:rPr>
+              <w:t>Min</w:t>
+            </w:r>
+            <w:r>
+              <w:rPr>
+                <w:rFonts w:eastAsia="DengXian" w:hint="eastAsia"/>
+                <w:b/>
+                <w:bCs/>
+                <w:sz w:val="18"/>
+                <w:szCs w:val="18"/>
+                <w:lang w:eastAsia="zh-CN"/>
+              </w:rPr>
+              <w:t xml:space="preserve"> Reward</w:t>
+            </w:r>
+          </w:p>
+        </w:tc>
+        <w:tc>
+          <w:tcPr>
+            <w:tcW w:w="1383" w:type="dxa"/>
+          </w:tcPr>
+          <w:p>
+            <w:pPr>
+              <w:rPr>
+                <w:rFonts w:eastAsia="DengXian" w:hint="eastAsia"/>
+                <w:b/>
+                <w:bCs/>
+                <w:sz w:val="18"/>
+                <w:szCs w:val="18"/>
+                <w:lang w:eastAsia="zh-CN"/>
+              </w:rPr>
+            </w:pPr>
+            <w:r>
+              <w:rPr>
+                <w:rFonts w:eastAsia="DengXian" w:hint="eastAsia"/>
+                <w:b/>
+                <w:bCs/>
+                <w:sz w:val="18"/>
+                <w:szCs w:val="18"/>
+                <w:lang w:eastAsia="zh-CN"/>
+              </w:rPr>
+              <w:t>Success Rate</w:t>
+            </w:r>
+          </w:p>
+        </w:tc>
+      </w:tr>
+      <w:tr>
+        <w:tc>
+          <w:tcPr>
+            <w:tcW w:w="1382" w:type="dxa"/>
+          </w:tcPr>
+          <w:p>
+            <w:pPr>
+              <w:jc w:val="center"/>
+              <w:rPr>
+                <w:rFonts w:eastAsia="DengXian" w:hint="eastAsia"/>
+                <w:b/>
+                <w:bCs/>
+                <w:sz w:val="18"/>
+                <w:szCs w:val="18"/>
+                <w:lang w:eastAsia="zh-CN"/>
+              </w:rPr>
+            </w:pPr>
+            <w:r>
+              <w:rPr>
+                <w:rFonts w:eastAsia="DengXian" w:hint="eastAsia"/>
+                <w:b/>
+                <w:bCs/>
+                <w:sz w:val="18"/>
+                <w:szCs w:val="18"/>
+                <w:lang w:eastAsia="zh-CN"/>
+              </w:rPr>
+              <w:t>0.9</w:t>
+            </w:r>
+            <w:r>
+              <w:rPr>
+                <w:rFonts w:eastAsia="DengXian" w:hint="eastAsia"/>
+                <w:b/>
+                <w:bCs/>
+                <w:sz w:val="18"/>
+                <w:szCs w:val="18"/>
+                <w:lang w:eastAsia="zh-CN"/>
+              </w:rPr>
+              <w:t>90</w:t>
+            </w:r>
+          </w:p>
+        </w:tc>
+        <w:tc>
+          <w:tcPr>
+            <w:tcW w:w="1382" w:type="dxa"/>
+          </w:tcPr>
+          <w:p>
+            <w:pPr>
+              <w:jc w:val="center"/>
+              <w:rPr>
+                <w:rFonts w:eastAsia="DengXian" w:hint="eastAsia"/>
+                <w:sz w:val="18"/>
+                <w:szCs w:val="18"/>
+                <w:lang w:eastAsia="zh-CN"/>
+              </w:rPr>
+            </w:pPr>
+            <w:r>
+              <w:rPr>
+                <w:rFonts w:eastAsia="DengXian" w:hint="eastAsia"/>
+                <w:sz w:val="18"/>
+                <w:szCs w:val="18"/>
+                <w:lang w:eastAsia="zh-CN"/>
+              </w:rPr>
+              <w:t>189.73</w:t>
+            </w:r>
+          </w:p>
+        </w:tc>
+        <w:tc>
+          <w:tcPr>
+            <w:tcW w:w="1383" w:type="dxa"/>
+          </w:tcPr>
+          <w:p>
+            <w:pPr>
+              <w:jc w:val="center"/>
+              <w:rPr>
+                <w:rFonts w:eastAsia="DengXian" w:hint="eastAsia"/>
+                <w:sz w:val="18"/>
+                <w:szCs w:val="18"/>
+                <w:lang w:eastAsia="zh-CN"/>
+              </w:rPr>
+            </w:pPr>
+            <w:r>
+              <w:rPr>
+                <w:rFonts w:eastAsia="DengXian" w:hint="eastAsia"/>
+                <w:sz w:val="18"/>
+                <w:szCs w:val="18"/>
+                <w:lang w:eastAsia="zh-CN"/>
+              </w:rPr>
+              <w:t>311.94</w:t>
+            </w:r>
+          </w:p>
+        </w:tc>
+        <w:tc>
+          <w:tcPr>
+            <w:tcW w:w="1383" w:type="dxa"/>
+          </w:tcPr>
+          <w:p>
+            <w:pPr>
+              <w:jc w:val="center"/>
+              <w:rPr>
+                <w:rFonts w:eastAsia="DengXian" w:hint="eastAsia"/>
+                <w:sz w:val="18"/>
+                <w:szCs w:val="18"/>
+                <w:lang w:eastAsia="zh-CN"/>
+              </w:rPr>
+            </w:pPr>
+            <w:r>
+              <w:rPr>
+                <w:rFonts w:eastAsia="DengXian" w:hint="eastAsia"/>
+                <w:sz w:val="18"/>
+                <w:szCs w:val="18"/>
+                <w:lang w:eastAsia="zh-CN"/>
+              </w:rPr>
+              <w:t>-672.61</w:t>
+            </w:r>
+          </w:p>
+        </w:tc>
+        <w:tc>
+          <w:tcPr>
+            <w:tcW w:w="1383" w:type="dxa"/>
+          </w:tcPr>
+          <w:p>
+            <w:pPr>
+              <w:jc w:val="center"/>
+              <w:rPr>
+                <w:rFonts w:eastAsia="DengXian" w:hint="eastAsia"/>
+                <w:sz w:val="18"/>
+                <w:szCs w:val="18"/>
+                <w:lang w:eastAsia="zh-CN"/>
+              </w:rPr>
+            </w:pPr>
+            <w:r>
+              <w:rPr>
+                <w:rFonts w:eastAsia="DengXian" w:hint="eastAsia"/>
+                <w:sz w:val="18"/>
+                <w:szCs w:val="18"/>
+                <w:lang w:eastAsia="zh-CN"/>
+              </w:rPr>
+              <w:t>79.0%</w:t>
+            </w:r>
+          </w:p>
+        </w:tc>
+      </w:tr>
+      <w:tr>
+        <w:tc>
+          <w:tcPr>
+            <w:tcW w:w="1382" w:type="dxa"/>
+          </w:tcPr>
+          <w:p>
+            <w:pPr>
+              <w:jc w:val="center"/>
+              <w:rPr>
+                <w:rFonts w:eastAsia="DengXian" w:hint="eastAsia"/>
+                <w:b/>
+                <w:bCs/>
+                <w:sz w:val="18"/>
+                <w:szCs w:val="18"/>
+                <w:lang w:eastAsia="zh-CN"/>
+              </w:rPr>
+            </w:pPr>
+            <w:r>
+              <w:rPr>
+                <w:rFonts w:eastAsia="DengXian" w:hint="eastAsia"/>
+                <w:b/>
+                <w:bCs/>
+                <w:sz w:val="18"/>
+                <w:szCs w:val="18"/>
+                <w:lang w:eastAsia="zh-CN"/>
+              </w:rPr>
+              <w:t>0.993</w:t>
+            </w:r>
+          </w:p>
+        </w:tc>
+        <w:tc>
+          <w:tcPr>
+            <w:tcW w:w="1382" w:type="dxa"/>
+          </w:tcPr>
+          <w:p>
+            <w:pPr>
+              <w:jc w:val="center"/>
+              <w:rPr>
+                <w:rFonts w:eastAsia="DengXian" w:hint="eastAsia"/>
+                <w:sz w:val="18"/>
+                <w:szCs w:val="18"/>
+                <w:lang w:eastAsia="zh-CN"/>
+              </w:rPr>
+            </w:pPr>
+            <w:r>
+              <w:rPr>
+                <w:rFonts w:eastAsia="DengXian" w:hint="eastAsia"/>
+                <w:sz w:val="18"/>
+                <w:szCs w:val="18"/>
+                <w:lang w:eastAsia="zh-CN"/>
+              </w:rPr>
+              <w:t>168.01</w:t>
+            </w:r>
+          </w:p>
+        </w:tc>
+        <w:tc>
+          <w:tcPr>
+            <w:tcW w:w="1383" w:type="dxa"/>
+          </w:tcPr>
+          <w:p>
+            <w:pPr>
+              <w:jc w:val="center"/>
+              <w:rPr>
+                <w:rFonts w:eastAsia="DengXian" w:hint="eastAsia"/>
+                <w:sz w:val="18"/>
+                <w:szCs w:val="18"/>
+                <w:lang w:eastAsia="zh-CN"/>
+              </w:rPr>
+            </w:pPr>
+            <w:r>
+              <w:rPr>
+                <w:rFonts w:eastAsia="DengXian" w:hint="eastAsia"/>
+                <w:sz w:val="18"/>
+                <w:szCs w:val="18"/>
+                <w:lang w:eastAsia="zh-CN"/>
+              </w:rPr>
+              <w:t>318.88</w:t>
+            </w:r>
+          </w:p>
+        </w:tc>
+        <w:tc>
+          <w:tcPr>
+            <w:tcW w:w="1383" w:type="dxa"/>
+          </w:tcPr>
+          <w:p>
+            <w:pPr>
+              <w:jc w:val="center"/>
+              <w:rPr>
+                <w:rFonts w:eastAsia="DengXian" w:hint="eastAsia"/>
+                <w:sz w:val="18"/>
+                <w:szCs w:val="18"/>
+                <w:lang w:eastAsia="zh-CN"/>
+              </w:rPr>
+            </w:pPr>
+            <w:r>
+              <w:rPr>
+                <w:rFonts w:eastAsia="DengXian" w:hint="eastAsia"/>
+                <w:sz w:val="18"/>
+                <w:szCs w:val="18"/>
+                <w:lang w:eastAsia="zh-CN"/>
+              </w:rPr>
+              <w:t>-444.79</w:t>
+            </w:r>
+          </w:p>
+        </w:tc>
+        <w:tc>
+          <w:tcPr>
+            <w:tcW w:w="1383" w:type="dxa"/>
+          </w:tcPr>
+          <w:p>
+            <w:pPr>
+              <w:jc w:val="center"/>
+              <w:rPr>
+                <w:rFonts w:eastAsia="DengXian" w:hint="eastAsia"/>
+                <w:sz w:val="18"/>
+                <w:szCs w:val="18"/>
+                <w:lang w:eastAsia="zh-CN"/>
+              </w:rPr>
+            </w:pPr>
+            <w:r>
+              <w:rPr>
+                <w:rFonts w:eastAsia="DengXian" w:hint="eastAsia"/>
+                <w:sz w:val="18"/>
+                <w:szCs w:val="18"/>
+                <w:lang w:eastAsia="zh-CN"/>
+              </w:rPr>
+              <w:t>72.0%</w:t>
+            </w:r>
+          </w:p>
+        </w:tc>
+      </w:tr>
+      <w:tr>
+        <w:tc>
+          <w:tcPr>
+            <w:tcW w:w="1382" w:type="dxa"/>
+          </w:tcPr>
+          <w:p>
+            <w:pPr>
+              <w:jc w:val="center"/>
+              <w:rPr>
+                <w:rFonts w:eastAsia="DengXian" w:hint="eastAsia"/>
+                <w:b/>
+                <w:bCs/>
+                <w:sz w:val="18"/>
+                <w:szCs w:val="18"/>
+                <w:lang w:eastAsia="zh-CN"/>
+              </w:rPr>
+            </w:pPr>
+            <w:r>
+              <w:rPr>
+                <w:rFonts w:eastAsia="DengXian" w:hint="eastAsia"/>
+                <w:b/>
+                <w:bCs/>
+                <w:sz w:val="18"/>
+                <w:szCs w:val="18"/>
+                <w:lang w:eastAsia="zh-CN"/>
+              </w:rPr>
+              <w:t>0.995</w:t>
+            </w:r>
+          </w:p>
+        </w:tc>
+        <w:tc>
+          <w:tcPr>
+            <w:tcW w:w="1382" w:type="dxa"/>
+          </w:tcPr>
+          <w:p>
+            <w:pPr>
+              <w:jc w:val="center"/>
+              <w:rPr>
+                <w:rFonts w:eastAsia="DengXian" w:hint="eastAsia"/>
+                <w:sz w:val="18"/>
+                <w:szCs w:val="18"/>
+                <w:lang w:eastAsia="zh-CN"/>
+              </w:rPr>
+            </w:pPr>
+            <w:r>
+              <w:rPr>
+                <w:rFonts w:eastAsia="DengXian" w:hint="eastAsia"/>
+                <w:sz w:val="18"/>
+                <w:szCs w:val="18"/>
+                <w:lang w:eastAsia="zh-CN"/>
+              </w:rPr>
+              <w:t>191.45</w:t>
+            </w:r>
+          </w:p>
+        </w:tc>
+        <w:tc>
+          <w:tcPr>
+            <w:tcW w:w="1383" w:type="dxa"/>
+          </w:tcPr>
+          <w:p>
+            <w:pPr>
+              <w:jc w:val="center"/>
+              <w:rPr>
+                <w:rFonts w:eastAsia="DengXian" w:hint="eastAsia"/>
+                <w:sz w:val="18"/>
+                <w:szCs w:val="18"/>
+                <w:lang w:eastAsia="zh-CN"/>
+              </w:rPr>
+            </w:pPr>
+            <w:r>
+              <w:rPr>
+                <w:rFonts w:eastAsia="DengXian" w:hint="eastAsia"/>
+                <w:sz w:val="18"/>
+                <w:szCs w:val="18"/>
+                <w:lang w:eastAsia="zh-CN"/>
+              </w:rPr>
+              <w:t>307.32</w:t>
+            </w:r>
+          </w:p>
+        </w:tc>
+        <w:tc>
+          <w:tcPr>
+            <w:tcW w:w="1383" w:type="dxa"/>
+          </w:tcPr>
+          <w:p>
+            <w:pPr>
+              <w:jc w:val="center"/>
+              <w:rPr>
+                <w:rFonts w:eastAsia="DengXian" w:hint="eastAsia"/>
+                <w:sz w:val="18"/>
+                <w:szCs w:val="18"/>
+                <w:lang w:eastAsia="zh-CN"/>
+              </w:rPr>
+            </w:pPr>
+            <w:r>
+              <w:rPr>
+                <w:rFonts w:eastAsia="DengXian" w:hint="eastAsia"/>
+                <w:sz w:val="18"/>
+                <w:szCs w:val="18"/>
+                <w:lang w:eastAsia="zh-CN"/>
+              </w:rPr>
+              <w:t>-145.11</w:t>
+            </w:r>
+          </w:p>
+        </w:tc>
+        <w:tc>
+          <w:tcPr>
+            <w:tcW w:w="1383" w:type="dxa"/>
+          </w:tcPr>
+          <w:p>
+            <w:pPr>
+              <w:jc w:val="center"/>
+              <w:rPr>
+                <w:rFonts w:eastAsia="DengXian" w:hint="eastAsia"/>
+                <w:sz w:val="18"/>
+                <w:szCs w:val="18"/>
+                <w:lang w:eastAsia="zh-CN"/>
+              </w:rPr>
+            </w:pPr>
+            <w:r>
+              <w:rPr>
+                <w:rFonts w:eastAsia="DengXian" w:hint="eastAsia"/>
+                <w:sz w:val="18"/>
+                <w:szCs w:val="18"/>
+                <w:lang w:eastAsia="zh-CN"/>
+              </w:rPr>
+              <w:t>72.0%</w:t>
+            </w:r>
+          </w:p>
+        </w:tc>
+      </w:tr>
+      <w:tr>
+        <w:tc>
+          <w:tcPr>
+            <w:tcW w:w="1382" w:type="dxa"/>
+          </w:tcPr>
+          <w:p>
+            <w:pPr>
+              <w:jc w:val="center"/>
+              <w:rPr>
+                <w:rFonts w:eastAsia="DengXian" w:hint="eastAsia"/>
+                <w:b/>
+                <w:bCs/>
+                <w:sz w:val="18"/>
+                <w:szCs w:val="18"/>
+                <w:lang w:eastAsia="zh-CN"/>
+              </w:rPr>
+            </w:pPr>
+            <w:r>
+              <w:rPr>
+                <w:rFonts w:eastAsia="DengXian" w:hint="eastAsia"/>
+                <w:b/>
+                <w:bCs/>
+                <w:sz w:val="18"/>
+                <w:szCs w:val="18"/>
+                <w:lang w:eastAsia="zh-CN"/>
+              </w:rPr>
+              <w:t>0.997</w:t>
+            </w:r>
+          </w:p>
+        </w:tc>
+        <w:tc>
+          <w:tcPr>
+            <w:tcW w:w="1382" w:type="dxa"/>
+          </w:tcPr>
+          <w:p>
+            <w:pPr>
+              <w:jc w:val="center"/>
+              <w:rPr>
+                <w:rFonts w:eastAsia="DengXian" w:hint="eastAsia"/>
+                <w:sz w:val="18"/>
+                <w:szCs w:val="18"/>
+                <w:lang w:eastAsia="zh-CN"/>
+              </w:rPr>
+            </w:pPr>
+            <w:r>
+              <w:rPr>
+                <w:rFonts w:eastAsia="DengXian" w:hint="eastAsia"/>
+                <w:sz w:val="18"/>
+                <w:szCs w:val="18"/>
+                <w:lang w:eastAsia="zh-CN"/>
+              </w:rPr>
+              <w:t>137.23</w:t>
+            </w:r>
+          </w:p>
+        </w:tc>
+        <w:tc>
+          <w:tcPr>
+            <w:tcW w:w="1383" w:type="dxa"/>
+          </w:tcPr>
+          <w:p>
+            <w:pPr>
+              <w:jc w:val="center"/>
+              <w:rPr>
+                <w:rFonts w:eastAsia="DengXian" w:hint="eastAsia"/>
+                <w:sz w:val="18"/>
+                <w:szCs w:val="18"/>
+                <w:lang w:eastAsia="zh-CN"/>
+              </w:rPr>
+            </w:pPr>
+            <w:r>
+              <w:rPr>
+                <w:rFonts w:eastAsia="DengXian" w:hint="eastAsia"/>
+                <w:sz w:val="18"/>
+                <w:szCs w:val="18"/>
+                <w:lang w:eastAsia="zh-CN"/>
+              </w:rPr>
+              <w:t>318.28</w:t>
+            </w:r>
+          </w:p>
+        </w:tc>
+        <w:tc>
+          <w:tcPr>
+            <w:tcW w:w="1383" w:type="dxa"/>
+          </w:tcPr>
+          <w:p>
+            <w:pPr>
+              <w:jc w:val="center"/>
+              <w:rPr>
+                <w:rFonts w:eastAsia="DengXian" w:hint="eastAsia"/>
+                <w:sz w:val="18"/>
+                <w:szCs w:val="18"/>
+                <w:lang w:eastAsia="zh-CN"/>
+              </w:rPr>
+            </w:pPr>
+            <w:r>
+              <w:rPr>
+                <w:rFonts w:eastAsia="DengXian" w:hint="eastAsia"/>
+                <w:sz w:val="18"/>
+                <w:szCs w:val="18"/>
+                <w:lang w:eastAsia="zh-CN"/>
+              </w:rPr>
+              <w:t>-414.73</w:t>
+            </w:r>
+          </w:p>
+        </w:tc>
+        <w:tc>
+          <w:tcPr>
+            <w:tcW w:w="1383" w:type="dxa"/>
+          </w:tcPr>
+          <w:p>
+            <w:pPr>
+              <w:jc w:val="center"/>
+              <w:rPr>
+                <w:rFonts w:eastAsia="DengXian" w:hint="eastAsia"/>
+                <w:sz w:val="18"/>
+                <w:szCs w:val="18"/>
+                <w:lang w:eastAsia="zh-CN"/>
+              </w:rPr>
+            </w:pPr>
+            <w:r>
+              <w:rPr>
+                <w:rFonts w:eastAsia="DengXian" w:hint="eastAsia"/>
+                <w:sz w:val="18"/>
+                <w:szCs w:val="18"/>
+                <w:lang w:eastAsia="zh-CN"/>
+              </w:rPr>
+              <w:t>65.0%</w:t>
+            </w:r>
+          </w:p>
+        </w:tc>
+      </w:tr>
+      <w:tr>
+        <w:tc>
+          <w:tcPr>
+            <w:tcW w:w="1382" w:type="dxa"/>
+          </w:tcPr>
+          <w:p>
+            <w:pPr>
+              <w:jc w:val="center"/>
+              <w:rPr>
+                <w:rFonts w:eastAsia="DengXian" w:hint="eastAsia"/>
+                <w:b/>
+                <w:bCs/>
+                <w:sz w:val="18"/>
+                <w:szCs w:val="18"/>
+                <w:lang w:eastAsia="zh-CN"/>
+              </w:rPr>
+            </w:pPr>
+            <w:r>
+              <w:rPr>
+                <w:rFonts w:eastAsia="DengXian" w:hint="eastAsia"/>
+                <w:b/>
+                <w:bCs/>
+                <w:sz w:val="18"/>
+                <w:szCs w:val="18"/>
+                <w:lang w:eastAsia="zh-CN"/>
+              </w:rPr>
+              <w:t>0.999</w:t>
+            </w:r>
+          </w:p>
+        </w:tc>
+        <w:tc>
+          <w:tcPr>
+            <w:tcW w:w="1382" w:type="dxa"/>
+          </w:tcPr>
+          <w:p>
+            <w:pPr>
+              <w:jc w:val="center"/>
+              <w:rPr>
+                <w:rFonts w:eastAsia="DengXian" w:hint="eastAsia"/>
+                <w:sz w:val="18"/>
+                <w:szCs w:val="18"/>
+                <w:lang w:eastAsia="zh-CN"/>
+              </w:rPr>
+            </w:pPr>
+            <w:r>
+              <w:rPr>
+                <w:rFonts w:eastAsia="DengXian" w:hint="eastAsia"/>
+                <w:sz w:val="18"/>
+                <w:szCs w:val="18"/>
+                <w:lang w:eastAsia="zh-CN"/>
+              </w:rPr>
+              <w:t>65.14</w:t>
+            </w:r>
+          </w:p>
+        </w:tc>
+        <w:tc>
+          <w:tcPr>
+            <w:tcW w:w="1383" w:type="dxa"/>
+          </w:tcPr>
+          <w:p>
+            <w:pPr>
+              <w:jc w:val="center"/>
+              <w:rPr>
+                <w:rFonts w:eastAsia="DengXian" w:hint="eastAsia"/>
+                <w:sz w:val="18"/>
+                <w:szCs w:val="18"/>
+                <w:lang w:eastAsia="zh-CN"/>
+              </w:rPr>
+            </w:pPr>
+            <w:r>
+              <w:rPr>
+                <w:rFonts w:eastAsia="DengXian" w:hint="eastAsia"/>
+                <w:sz w:val="18"/>
+                <w:szCs w:val="18"/>
+                <w:lang w:eastAsia="zh-CN"/>
+              </w:rPr>
+              <w:t>287.72</w:t>
+            </w:r>
+          </w:p>
+        </w:tc>
+        <w:tc>
+          <w:tcPr>
+            <w:tcW w:w="1383" w:type="dxa"/>
+          </w:tcPr>
+          <w:p>
+            <w:pPr>
+              <w:jc w:val="center"/>
+              <w:rPr>
+                <w:rFonts w:eastAsia="DengXian" w:hint="eastAsia"/>
+                <w:sz w:val="18"/>
+                <w:szCs w:val="18"/>
+                <w:lang w:eastAsia="zh-CN"/>
+              </w:rPr>
+            </w:pPr>
+            <w:r>
+              <w:rPr>
+                <w:rFonts w:eastAsia="DengXian" w:hint="eastAsia"/>
+                <w:sz w:val="18"/>
+                <w:szCs w:val="18"/>
+                <w:lang w:eastAsia="zh-CN"/>
+              </w:rPr>
+              <w:t>-146.52</w:t>
+            </w:r>
+          </w:p>
+        </w:tc>
+        <w:tc>
+          <w:tcPr>
+            <w:tcW w:w="1383" w:type="dxa"/>
+          </w:tcPr>
+          <w:p>
+            <w:pPr>
+              <w:jc w:val="center"/>
+              <w:rPr>
+                <w:rFonts w:eastAsia="DengXian" w:hint="eastAsia"/>
+                <w:sz w:val="18"/>
+                <w:szCs w:val="18"/>
+                <w:lang w:eastAsia="zh-CN"/>
+              </w:rPr>
+            </w:pPr>
+            <w:r>
+              <w:rPr>
+                <w:rFonts w:eastAsia="DengXian" w:hint="eastAsia"/>
+                <w:sz w:val="18"/>
+                <w:szCs w:val="18"/>
+                <w:lang w:eastAsia="zh-CN"/>
+              </w:rPr>
+              <w:t>13.0%</w:t>
+            </w:r>
+          </w:p>
+        </w:tc>
+      </w:tr>
+    </w:tbl>
+    <w:p>
+      <w:pPr>
+        <w:rPr>
+          <w:rFonts w:eastAsia="DengXian" w:hint="eastAsia"/>
+          <w:szCs w:val="24"/>
+          <w:lang w:eastAsia="zh-CN"/>
+        </w:rPr>
       </w:pPr>
       <w:r>
+        <w:rPr>
+          <w:rFonts w:eastAsia="DengXian"/>
+          <w:szCs w:val="24"/>
+          <w:lang w:eastAsia="zh-CN"/>
+        </w:rPr>
+        <w:lastRenderedPageBreak/>
+        <w:t>The results show that the epsilon decay value has a clear effect on the DQN agent’s performance. Among the tested values, 0.990 achieved the highest success rate at 79.0%, with a mean reward of 189.73, while 0.995 achieved the highest mean reward of 191.45 with a success rate of 72.0%.</w:t>
+      </w:r>
+      <w:r>
+        <w:rPr>
+          <w:rFonts w:eastAsia="DengXian" w:hint="eastAsia"/>
+          <w:szCs w:val="24"/>
+          <w:lang w:eastAsia="zh-CN"/>
+        </w:rPr>
+        <w:t xml:space="preserve"> </w:t>
+      </w:r>
+      <w:r>
+        <w:rPr>
+          <w:rFonts w:eastAsia="DengXian"/>
+          <w:szCs w:val="24"/>
+          <w:lang w:eastAsia="zh-CN"/>
+        </w:rPr>
+        <w:t xml:space="preserve">In contrast, when the </w:t>
+      </w:r>
+      <w:r>
+        <w:rPr>
+          <w:rFonts w:eastAsia="DengXian" w:hint="eastAsia"/>
+          <w:szCs w:val="24"/>
+          <w:lang w:eastAsia="zh-CN"/>
+        </w:rPr>
+        <w:t xml:space="preserve">episode </w:t>
+      </w:r>
+      <w:r>
+        <w:rPr>
+          <w:rFonts w:eastAsia="DengXian"/>
+          <w:szCs w:val="24"/>
+          <w:lang w:eastAsia="zh-CN"/>
+        </w:rPr>
+        <w:t>decay</w:t>
+      </w:r>
+      <w:r>
+        <w:rPr>
+          <w:rFonts w:eastAsia="DengXian" w:hint="eastAsia"/>
+          <w:szCs w:val="24"/>
+          <w:lang w:eastAsia="zh-CN"/>
+        </w:rPr>
+        <w:t xml:space="preserve"> </w:t>
+      </w:r>
+      <w:r>
+        <w:rPr>
+          <w:rFonts w:eastAsia="DengXian"/>
+          <w:szCs w:val="24"/>
+          <w:lang w:eastAsia="zh-CN"/>
+        </w:rPr>
+        <w:t>was too high, especially 0.999, the performance dropped significantly, with only 13.0% success rate</w:t>
+      </w:r>
+      <w:r>
+        <w:rPr>
+          <w:rFonts w:eastAsia="DengXian" w:hint="eastAsia"/>
+          <w:szCs w:val="24"/>
+          <w:lang w:eastAsia="zh-CN"/>
+        </w:rPr>
+        <w:t xml:space="preserve"> with a much lower mean reward of 65.14.</w:t>
+      </w:r>
+    </w:p>
+    <w:p>
+      <w:pPr>
         <w:rPr>
           <w:rFonts w:eastAsia="DengXian"/>
           <w:b/>
@@ -584,7 +1459,17 @@
           <w:szCs w:val="28"/>
           <w:lang w:eastAsia="zh-CN"/>
         </w:rPr>
-        <w:t xml:space="preserve">Experiment </w:t>
+      </w:pPr>
+      <w:r>
+        <w:rPr>
+          <w:rFonts w:eastAsia="DengXian"/>
+          <w:b/>
+          <w:bCs/>
+          <w:sz w:val="28"/>
+          <w:szCs w:val="28"/>
+          <w:lang w:eastAsia="zh-CN"/>
+        </w:rPr>
+        <w:t>Experiment B</w:t>
       </w:r>
       <w:r>
         <w:rPr>
@@ -595,8 +1480,1075 @@
           <w:szCs w:val="28"/>
           <w:lang w:eastAsia="zh-CN"/>
         </w:rPr>
+        <w:t xml:space="preserve">: </w:t>
+      </w:r>
+      <w:r>
+        <w:rPr>
+          <w:rFonts w:eastAsia="DengXian" w:hint="eastAsia"/>
+          <w:b/>
+          <w:bCs/>
+          <w:sz w:val="28"/>
+          <w:szCs w:val="28"/>
+          <w:lang w:eastAsia="zh-CN"/>
+        </w:rPr>
+        <w:t>Learning Rate</w:t>
+      </w:r>
+    </w:p>
+    <w:tbl>
+      <w:tblPr>
+        <w:tblStyle w:val="af2"/>
+        <w:tblW w:w="0" w:type="auto"/>
+        <w:tblLook w:val="04A0" w:firstRow="1" w:lastRow="0" w:firstColumn="1" w:lastColumn="0" w:noHBand="0" w:noVBand="1"/>
+      </w:tblPr>
+      <w:tblGrid>
+        <w:gridCol w:w="1382"/>
+        <w:gridCol w:w="1382"/>
+        <w:gridCol w:w="1383"/>
+        <w:gridCol w:w="1383"/>
+        <w:gridCol w:w="1383"/>
+      </w:tblGrid>
+      <w:tr>
+        <w:tc>
+          <w:tcPr>
+            <w:tcW w:w="1382" w:type="dxa"/>
+          </w:tcPr>
+          <w:p>
+            <w:pPr>
+              <w:rPr>
+                <w:rFonts w:eastAsia="DengXian" w:hint="eastAsia"/>
+                <w:b/>
+                <w:bCs/>
+                <w:sz w:val="18"/>
+                <w:szCs w:val="18"/>
+                <w:lang w:eastAsia="zh-CN"/>
+              </w:rPr>
+            </w:pPr>
+            <w:r>
+              <w:rPr>
+                <w:rFonts w:eastAsia="DengXian" w:hint="eastAsia"/>
+                <w:b/>
+                <w:bCs/>
+                <w:sz w:val="18"/>
+                <w:szCs w:val="18"/>
+                <w:lang w:eastAsia="zh-CN"/>
+              </w:rPr>
+              <w:t>Learning Rate</w:t>
+            </w:r>
+          </w:p>
+        </w:tc>
+        <w:tc>
+          <w:tcPr>
+            <w:tcW w:w="1382" w:type="dxa"/>
+          </w:tcPr>
+          <w:p>
+            <w:pPr>
+              <w:rPr>
+                <w:rFonts w:eastAsia="DengXian" w:hint="eastAsia"/>
+                <w:b/>
+                <w:bCs/>
+                <w:sz w:val="18"/>
+                <w:szCs w:val="18"/>
+                <w:lang w:eastAsia="zh-CN"/>
+              </w:rPr>
+            </w:pPr>
+            <w:r>
+              <w:rPr>
+                <w:rFonts w:eastAsia="DengXian" w:hint="eastAsia"/>
+                <w:b/>
+                <w:bCs/>
+                <w:sz w:val="18"/>
+                <w:szCs w:val="18"/>
+                <w:lang w:eastAsia="zh-CN"/>
+              </w:rPr>
+              <w:t>Mean Reward</w:t>
+            </w:r>
+          </w:p>
+        </w:tc>
+        <w:tc>
+          <w:tcPr>
+            <w:tcW w:w="1383" w:type="dxa"/>
+          </w:tcPr>
+          <w:p>
+            <w:pPr>
+              <w:rPr>
+                <w:rFonts w:eastAsia="DengXian" w:hint="eastAsia"/>
+                <w:b/>
+                <w:bCs/>
+                <w:sz w:val="18"/>
+                <w:szCs w:val="18"/>
+                <w:lang w:eastAsia="zh-CN"/>
+              </w:rPr>
+            </w:pPr>
+            <w:r>
+              <w:rPr>
+                <w:rFonts w:eastAsia="DengXian" w:hint="eastAsia"/>
+                <w:b/>
+                <w:bCs/>
+                <w:sz w:val="18"/>
+                <w:szCs w:val="18"/>
+                <w:lang w:eastAsia="zh-CN"/>
+              </w:rPr>
+              <w:t>Max Reward</w:t>
+            </w:r>
+          </w:p>
+        </w:tc>
+        <w:tc>
+          <w:tcPr>
+            <w:tcW w:w="1383" w:type="dxa"/>
+          </w:tcPr>
+          <w:p>
+            <w:pPr>
+              <w:rPr>
+                <w:rFonts w:eastAsia="DengXian" w:hint="eastAsia"/>
+                <w:b/>
+                <w:bCs/>
+                <w:sz w:val="18"/>
+                <w:szCs w:val="18"/>
+                <w:lang w:eastAsia="zh-CN"/>
+              </w:rPr>
+            </w:pPr>
+            <w:r>
+              <w:rPr>
+                <w:rFonts w:eastAsia="DengXian"/>
+                <w:b/>
+                <w:bCs/>
+                <w:sz w:val="18"/>
+                <w:szCs w:val="18"/>
+                <w:lang w:eastAsia="zh-CN"/>
+              </w:rPr>
+              <w:t>Min</w:t>
+            </w:r>
+            <w:r>
+              <w:rPr>
+                <w:rFonts w:eastAsia="DengXian" w:hint="eastAsia"/>
+                <w:b/>
+                <w:bCs/>
+                <w:sz w:val="18"/>
+                <w:szCs w:val="18"/>
+                <w:lang w:eastAsia="zh-CN"/>
+              </w:rPr>
+              <w:t xml:space="preserve"> Reward</w:t>
+            </w:r>
+          </w:p>
+        </w:tc>
+        <w:tc>
+          <w:tcPr>
+            <w:tcW w:w="1383" w:type="dxa"/>
+          </w:tcPr>
+          <w:p>
+            <w:pPr>
+              <w:rPr>
+                <w:rFonts w:eastAsia="DengXian" w:hint="eastAsia"/>
+                <w:b/>
+                <w:bCs/>
+                <w:sz w:val="18"/>
+                <w:szCs w:val="18"/>
+                <w:lang w:eastAsia="zh-CN"/>
+              </w:rPr>
+            </w:pPr>
+            <w:r>
+              <w:rPr>
+                <w:rFonts w:eastAsia="DengXian" w:hint="eastAsia"/>
+                <w:b/>
+                <w:bCs/>
+                <w:sz w:val="18"/>
+                <w:szCs w:val="18"/>
+                <w:lang w:eastAsia="zh-CN"/>
+              </w:rPr>
+              <w:t>Success Rate</w:t>
+            </w:r>
+          </w:p>
+        </w:tc>
+      </w:tr>
+      <w:tr>
+        <w:tc>
+          <w:tcPr>
+            <w:tcW w:w="1382" w:type="dxa"/>
+          </w:tcPr>
+          <w:p>
+            <w:pPr>
+              <w:jc w:val="center"/>
+              <w:rPr>
+                <w:rFonts w:eastAsia="DengXian" w:hint="eastAsia"/>
+                <w:b/>
+                <w:bCs/>
+                <w:sz w:val="18"/>
+                <w:szCs w:val="18"/>
+                <w:lang w:eastAsia="zh-CN"/>
+              </w:rPr>
+            </w:pPr>
+            <w:r>
+              <w:rPr>
+                <w:rFonts w:eastAsia="DengXian" w:hint="eastAsia"/>
+                <w:b/>
+                <w:bCs/>
+                <w:sz w:val="18"/>
+                <w:szCs w:val="18"/>
+                <w:lang w:eastAsia="zh-CN"/>
+              </w:rPr>
+              <w:t>1e-4</w:t>
+            </w:r>
+          </w:p>
+        </w:tc>
+        <w:tc>
+          <w:tcPr>
+            <w:tcW w:w="1382" w:type="dxa"/>
+          </w:tcPr>
+          <w:p>
+            <w:pPr>
+              <w:jc w:val="center"/>
+              <w:rPr>
+                <w:rFonts w:eastAsia="DengXian" w:hint="eastAsia"/>
+                <w:sz w:val="18"/>
+                <w:szCs w:val="18"/>
+                <w:lang w:eastAsia="zh-CN"/>
+              </w:rPr>
+            </w:pPr>
+          </w:p>
+        </w:tc>
+        <w:tc>
+          <w:tcPr>
+            <w:tcW w:w="1383" w:type="dxa"/>
+          </w:tcPr>
+          <w:p>
+            <w:pPr>
+              <w:jc w:val="center"/>
+              <w:rPr>
+                <w:rFonts w:eastAsia="DengXian" w:hint="eastAsia"/>
+                <w:sz w:val="18"/>
+                <w:szCs w:val="18"/>
+                <w:lang w:eastAsia="zh-CN"/>
+              </w:rPr>
+            </w:pPr>
+          </w:p>
+        </w:tc>
+        <w:tc>
+          <w:tcPr>
+            <w:tcW w:w="1383" w:type="dxa"/>
+          </w:tcPr>
+          <w:p>
+            <w:pPr>
+              <w:jc w:val="center"/>
+              <w:rPr>
+                <w:rFonts w:eastAsia="DengXian" w:hint="eastAsia"/>
+                <w:sz w:val="18"/>
+                <w:szCs w:val="18"/>
+                <w:lang w:eastAsia="zh-CN"/>
+              </w:rPr>
+            </w:pPr>
+          </w:p>
+        </w:tc>
+        <w:tc>
+          <w:tcPr>
+            <w:tcW w:w="1383" w:type="dxa"/>
+          </w:tcPr>
+          <w:p>
+            <w:pPr>
+              <w:jc w:val="center"/>
+              <w:rPr>
+                <w:rFonts w:eastAsia="DengXian" w:hint="eastAsia"/>
+                <w:sz w:val="18"/>
+                <w:szCs w:val="18"/>
+                <w:lang w:eastAsia="zh-CN"/>
+              </w:rPr>
+            </w:pPr>
+          </w:p>
+        </w:tc>
+      </w:tr>
+      <w:tr>
+        <w:tc>
+          <w:tcPr>
+            <w:tcW w:w="1382" w:type="dxa"/>
+          </w:tcPr>
+          <w:p>
+            <w:pPr>
+              <w:jc w:val="center"/>
+              <w:rPr>
+                <w:rFonts w:eastAsia="DengXian" w:hint="eastAsia"/>
+                <w:b/>
+                <w:bCs/>
+                <w:sz w:val="18"/>
+                <w:szCs w:val="18"/>
+                <w:lang w:eastAsia="zh-CN"/>
+              </w:rPr>
+            </w:pPr>
+            <w:r>
+              <w:rPr>
+                <w:rFonts w:eastAsia="DengXian" w:hint="eastAsia"/>
+                <w:b/>
+                <w:bCs/>
+                <w:sz w:val="18"/>
+                <w:szCs w:val="18"/>
+                <w:lang w:eastAsia="zh-CN"/>
+              </w:rPr>
+              <w:t>5e-4</w:t>
+            </w:r>
+          </w:p>
+        </w:tc>
+        <w:tc>
+          <w:tcPr>
+            <w:tcW w:w="1382" w:type="dxa"/>
+          </w:tcPr>
+          <w:p>
+            <w:pPr>
+              <w:jc w:val="center"/>
+              <w:rPr>
+                <w:rFonts w:eastAsia="DengXian" w:hint="eastAsia"/>
+                <w:sz w:val="18"/>
+                <w:szCs w:val="18"/>
+                <w:lang w:eastAsia="zh-CN"/>
+              </w:rPr>
+            </w:pPr>
+            <w:r>
+              <w:rPr>
+                <w:rFonts w:eastAsia="DengXian" w:hint="eastAsia"/>
+                <w:sz w:val="18"/>
+                <w:szCs w:val="18"/>
+                <w:lang w:eastAsia="zh-CN"/>
+              </w:rPr>
+              <w:t>191.45</w:t>
+            </w:r>
+          </w:p>
+        </w:tc>
+        <w:tc>
+          <w:tcPr>
+            <w:tcW w:w="1383" w:type="dxa"/>
+          </w:tcPr>
+          <w:p>
+            <w:pPr>
+              <w:jc w:val="center"/>
+              <w:rPr>
+                <w:rFonts w:eastAsia="DengXian" w:hint="eastAsia"/>
+                <w:sz w:val="18"/>
+                <w:szCs w:val="18"/>
+                <w:lang w:eastAsia="zh-CN"/>
+              </w:rPr>
+            </w:pPr>
+            <w:r>
+              <w:rPr>
+                <w:rFonts w:eastAsia="DengXian" w:hint="eastAsia"/>
+                <w:sz w:val="18"/>
+                <w:szCs w:val="18"/>
+                <w:lang w:eastAsia="zh-CN"/>
+              </w:rPr>
+              <w:t>307.32</w:t>
+            </w:r>
+          </w:p>
+        </w:tc>
+        <w:tc>
+          <w:tcPr>
+            <w:tcW w:w="1383" w:type="dxa"/>
+          </w:tcPr>
+          <w:p>
+            <w:pPr>
+              <w:jc w:val="center"/>
+              <w:rPr>
+                <w:rFonts w:eastAsia="DengXian" w:hint="eastAsia"/>
+                <w:sz w:val="18"/>
+                <w:szCs w:val="18"/>
+                <w:lang w:eastAsia="zh-CN"/>
+              </w:rPr>
+            </w:pPr>
+            <w:r>
+              <w:rPr>
+                <w:rFonts w:eastAsia="DengXian" w:hint="eastAsia"/>
+                <w:sz w:val="18"/>
+                <w:szCs w:val="18"/>
+                <w:lang w:eastAsia="zh-CN"/>
+              </w:rPr>
+              <w:t>-145.11</w:t>
+            </w:r>
+          </w:p>
+        </w:tc>
+        <w:tc>
+          <w:tcPr>
+            <w:tcW w:w="1383" w:type="dxa"/>
+          </w:tcPr>
+          <w:p>
+            <w:pPr>
+              <w:jc w:val="center"/>
+              <w:rPr>
+                <w:rFonts w:eastAsia="DengXian" w:hint="eastAsia"/>
+                <w:sz w:val="18"/>
+                <w:szCs w:val="18"/>
+                <w:lang w:eastAsia="zh-CN"/>
+              </w:rPr>
+            </w:pPr>
+            <w:r>
+              <w:rPr>
+                <w:rFonts w:eastAsia="DengXian" w:hint="eastAsia"/>
+                <w:sz w:val="18"/>
+                <w:szCs w:val="18"/>
+                <w:lang w:eastAsia="zh-CN"/>
+              </w:rPr>
+              <w:t>72.0%</w:t>
+            </w:r>
+          </w:p>
+        </w:tc>
+      </w:tr>
+      <w:tr>
+        <w:tc>
+          <w:tcPr>
+            <w:tcW w:w="1382" w:type="dxa"/>
+          </w:tcPr>
+          <w:p>
+            <w:pPr>
+              <w:jc w:val="center"/>
+              <w:rPr>
+                <w:rFonts w:eastAsia="DengXian" w:hint="eastAsia"/>
+                <w:b/>
+                <w:bCs/>
+                <w:sz w:val="18"/>
+                <w:szCs w:val="18"/>
+                <w:lang w:eastAsia="zh-CN"/>
+              </w:rPr>
+            </w:pPr>
+            <w:r>
+              <w:rPr>
+                <w:rFonts w:eastAsia="DengXian" w:hint="eastAsia"/>
+                <w:b/>
+                <w:bCs/>
+                <w:sz w:val="18"/>
+                <w:szCs w:val="18"/>
+                <w:lang w:eastAsia="zh-CN"/>
+              </w:rPr>
+              <w:t>1e-3</w:t>
+            </w:r>
+          </w:p>
+        </w:tc>
+        <w:tc>
+          <w:tcPr>
+            <w:tcW w:w="1382" w:type="dxa"/>
+          </w:tcPr>
+          <w:p>
+            <w:pPr>
+              <w:jc w:val="center"/>
+              <w:rPr>
+                <w:rFonts w:eastAsia="DengXian" w:hint="eastAsia"/>
+                <w:sz w:val="18"/>
+                <w:szCs w:val="18"/>
+                <w:lang w:eastAsia="zh-CN"/>
+              </w:rPr>
+            </w:pPr>
+          </w:p>
+        </w:tc>
+        <w:tc>
+          <w:tcPr>
+            <w:tcW w:w="1383" w:type="dxa"/>
+          </w:tcPr>
+          <w:p>
+            <w:pPr>
+              <w:jc w:val="center"/>
+              <w:rPr>
+                <w:rFonts w:eastAsia="DengXian" w:hint="eastAsia"/>
+                <w:sz w:val="18"/>
+                <w:szCs w:val="18"/>
+                <w:lang w:eastAsia="zh-CN"/>
+              </w:rPr>
+            </w:pPr>
+          </w:p>
+        </w:tc>
+        <w:tc>
+          <w:tcPr>
+            <w:tcW w:w="1383" w:type="dxa"/>
+          </w:tcPr>
+          <w:p>
+            <w:pPr>
+              <w:jc w:val="center"/>
+              <w:rPr>
+                <w:rFonts w:eastAsia="DengXian" w:hint="eastAsia"/>
+                <w:sz w:val="18"/>
+                <w:szCs w:val="18"/>
+                <w:lang w:eastAsia="zh-CN"/>
+              </w:rPr>
+            </w:pPr>
+          </w:p>
+        </w:tc>
+        <w:tc>
+          <w:tcPr>
+            <w:tcW w:w="1383" w:type="dxa"/>
+          </w:tcPr>
+          <w:p>
+            <w:pPr>
+              <w:jc w:val="center"/>
+              <w:rPr>
+                <w:rFonts w:eastAsia="DengXian" w:hint="eastAsia"/>
+                <w:sz w:val="18"/>
+                <w:szCs w:val="18"/>
+                <w:lang w:eastAsia="zh-CN"/>
+              </w:rPr>
+            </w:pPr>
+          </w:p>
+        </w:tc>
+      </w:tr>
+    </w:tbl>
+    <w:p>
+      <w:pPr>
+        <w:rPr>
+          <w:rFonts w:eastAsia="DengXian" w:hint="eastAsia"/>
+          <w:b/>
+          <w:bCs/>
+          <w:sz w:val="28"/>
+          <w:szCs w:val="28"/>
+          <w:lang w:eastAsia="zh-CN"/>
+        </w:rPr>
+      </w:pPr>
+    </w:p>
+    <w:p>
+      <w:pPr>
+        <w:rPr>
+          <w:rFonts w:eastAsia="DengXian"/>
+          <w:b/>
+          <w:bCs/>
+          <w:sz w:val="28"/>
+          <w:szCs w:val="28"/>
+          <w:lang w:eastAsia="zh-CN"/>
+        </w:rPr>
+      </w:pPr>
+      <w:r>
+        <w:rPr>
+          <w:rFonts w:eastAsia="DengXian"/>
+          <w:b/>
+          <w:bCs/>
+          <w:sz w:val="28"/>
+          <w:szCs w:val="28"/>
+          <w:lang w:eastAsia="zh-CN"/>
+        </w:rPr>
+        <w:t xml:space="preserve">Experiment </w:t>
+      </w:r>
+      <w:r>
+        <w:rPr>
+          <w:rFonts w:eastAsia="DengXian" w:hint="eastAsia"/>
+          <w:b/>
+          <w:bCs/>
+          <w:sz w:val="28"/>
+          <w:szCs w:val="28"/>
+          <w:lang w:eastAsia="zh-CN"/>
+        </w:rPr>
         <w:t>C</w:t>
       </w:r>
+      <w:r>
+        <w:rPr>
+          <w:rFonts w:eastAsia="DengXian" w:hint="eastAsia"/>
+          <w:b/>
+          <w:bCs/>
+          <w:sz w:val="28"/>
+          <w:szCs w:val="28"/>
+          <w:lang w:eastAsia="zh-CN"/>
+        </w:rPr>
+        <w:t>: Target</w:t>
+      </w:r>
+      <w:r>
+        <w:rPr>
+          <w:rFonts w:eastAsia="DengXian" w:hint="eastAsia"/>
+          <w:b/>
+          <w:bCs/>
+          <w:sz w:val="28"/>
+          <w:szCs w:val="28"/>
+          <w:lang w:eastAsia="zh-CN"/>
+        </w:rPr>
+        <w:t xml:space="preserve"> update frequency</w:t>
+      </w:r>
+    </w:p>
+    <w:tbl>
+      <w:tblPr>
+        <w:tblStyle w:val="af2"/>
+        <w:tblW w:w="0" w:type="auto"/>
+        <w:tblLook w:val="04A0" w:firstRow="1" w:lastRow="0" w:firstColumn="1" w:lastColumn="0" w:noHBand="0" w:noVBand="1"/>
+      </w:tblPr>
+      <w:tblGrid>
+        <w:gridCol w:w="1382"/>
+        <w:gridCol w:w="1382"/>
+        <w:gridCol w:w="1383"/>
+        <w:gridCol w:w="1383"/>
+        <w:gridCol w:w="1383"/>
+      </w:tblGrid>
+      <w:tr>
+        <w:tc>
+          <w:tcPr>
+            <w:tcW w:w="1382" w:type="dxa"/>
+          </w:tcPr>
+          <w:p>
+            <w:pPr>
+              <w:rPr>
+                <w:rFonts w:eastAsia="DengXian" w:hint="eastAsia"/>
+                <w:b/>
+                <w:bCs/>
+                <w:sz w:val="18"/>
+                <w:szCs w:val="18"/>
+                <w:lang w:eastAsia="zh-CN"/>
+              </w:rPr>
+            </w:pPr>
+            <w:r>
+              <w:rPr>
+                <w:rFonts w:eastAsia="DengXian"/>
+                <w:b/>
+                <w:bCs/>
+                <w:sz w:val="18"/>
+                <w:szCs w:val="18"/>
+                <w:lang w:eastAsia="zh-CN"/>
+              </w:rPr>
+              <w:t>Target update frequency</w:t>
+            </w:r>
+          </w:p>
+        </w:tc>
+        <w:tc>
+          <w:tcPr>
+            <w:tcW w:w="1382" w:type="dxa"/>
+          </w:tcPr>
+          <w:p>
+            <w:pPr>
+              <w:rPr>
+                <w:rFonts w:eastAsia="DengXian" w:hint="eastAsia"/>
+                <w:b/>
+                <w:bCs/>
+                <w:sz w:val="18"/>
+                <w:szCs w:val="18"/>
+                <w:lang w:eastAsia="zh-CN"/>
+              </w:rPr>
+            </w:pPr>
+            <w:r>
+              <w:rPr>
+                <w:rFonts w:eastAsia="DengXian" w:hint="eastAsia"/>
+                <w:b/>
+                <w:bCs/>
+                <w:sz w:val="18"/>
+                <w:szCs w:val="18"/>
+                <w:lang w:eastAsia="zh-CN"/>
+              </w:rPr>
+              <w:t>Mean Reward</w:t>
+            </w:r>
+          </w:p>
+        </w:tc>
+        <w:tc>
+          <w:tcPr>
+            <w:tcW w:w="1383" w:type="dxa"/>
+          </w:tcPr>
+          <w:p>
+            <w:pPr>
+              <w:rPr>
+                <w:rFonts w:eastAsia="DengXian" w:hint="eastAsia"/>
+                <w:b/>
+                <w:bCs/>
+                <w:sz w:val="18"/>
+                <w:szCs w:val="18"/>
+                <w:lang w:eastAsia="zh-CN"/>
+              </w:rPr>
+            </w:pPr>
+            <w:r>
+              <w:rPr>
+                <w:rFonts w:eastAsia="DengXian" w:hint="eastAsia"/>
+                <w:b/>
+                <w:bCs/>
+                <w:sz w:val="18"/>
+                <w:szCs w:val="18"/>
+                <w:lang w:eastAsia="zh-CN"/>
+              </w:rPr>
+              <w:t>Max Reward</w:t>
+            </w:r>
+          </w:p>
+        </w:tc>
+        <w:tc>
+          <w:tcPr>
+            <w:tcW w:w="1383" w:type="dxa"/>
+          </w:tcPr>
+          <w:p>
+            <w:pPr>
+              <w:rPr>
+                <w:rFonts w:eastAsia="DengXian" w:hint="eastAsia"/>
+                <w:b/>
+                <w:bCs/>
+                <w:sz w:val="18"/>
+                <w:szCs w:val="18"/>
+                <w:lang w:eastAsia="zh-CN"/>
+              </w:rPr>
+            </w:pPr>
+            <w:r>
+              <w:rPr>
+                <w:rFonts w:eastAsia="DengXian"/>
+                <w:b/>
+                <w:bCs/>
+                <w:sz w:val="18"/>
+                <w:szCs w:val="18"/>
+                <w:lang w:eastAsia="zh-CN"/>
+              </w:rPr>
+              <w:t>Min</w:t>
+            </w:r>
+            <w:r>
+              <w:rPr>
+                <w:rFonts w:eastAsia="DengXian" w:hint="eastAsia"/>
+                <w:b/>
+                <w:bCs/>
+                <w:sz w:val="18"/>
+                <w:szCs w:val="18"/>
+                <w:lang w:eastAsia="zh-CN"/>
+              </w:rPr>
+              <w:t xml:space="preserve"> Reward</w:t>
+            </w:r>
+          </w:p>
+        </w:tc>
+        <w:tc>
+          <w:tcPr>
+            <w:tcW w:w="1383" w:type="dxa"/>
+          </w:tcPr>
+          <w:p>
+            <w:pPr>
+              <w:rPr>
+                <w:rFonts w:eastAsia="DengXian" w:hint="eastAsia"/>
+                <w:b/>
+                <w:bCs/>
+                <w:sz w:val="18"/>
+                <w:szCs w:val="18"/>
+                <w:lang w:eastAsia="zh-CN"/>
+              </w:rPr>
+            </w:pPr>
+            <w:r>
+              <w:rPr>
+                <w:rFonts w:eastAsia="DengXian" w:hint="eastAsia"/>
+                <w:b/>
+                <w:bCs/>
+                <w:sz w:val="18"/>
+                <w:szCs w:val="18"/>
+                <w:lang w:eastAsia="zh-CN"/>
+              </w:rPr>
+              <w:t>Success Rate</w:t>
+            </w:r>
+          </w:p>
+        </w:tc>
+      </w:tr>
+      <w:tr>
+        <w:tc>
+          <w:tcPr>
+            <w:tcW w:w="1382" w:type="dxa"/>
+          </w:tcPr>
+          <w:p>
+            <w:pPr>
+              <w:jc w:val="center"/>
+              <w:rPr>
+                <w:rFonts w:eastAsia="DengXian" w:hint="eastAsia"/>
+                <w:b/>
+                <w:bCs/>
+                <w:sz w:val="18"/>
+                <w:szCs w:val="18"/>
+                <w:lang w:eastAsia="zh-CN"/>
+              </w:rPr>
+            </w:pPr>
+            <w:r>
+              <w:rPr>
+                <w:rFonts w:eastAsia="DengXian" w:hint="eastAsia"/>
+                <w:b/>
+                <w:bCs/>
+                <w:sz w:val="18"/>
+                <w:szCs w:val="18"/>
+                <w:lang w:eastAsia="zh-CN"/>
+              </w:rPr>
+              <w:t>5</w:t>
+            </w:r>
+          </w:p>
+        </w:tc>
+        <w:tc>
+          <w:tcPr>
+            <w:tcW w:w="1382" w:type="dxa"/>
+          </w:tcPr>
+          <w:p>
+            <w:pPr>
+              <w:jc w:val="center"/>
+              <w:rPr>
+                <w:rFonts w:eastAsia="DengXian" w:hint="eastAsia"/>
+                <w:sz w:val="18"/>
+                <w:szCs w:val="18"/>
+                <w:lang w:eastAsia="zh-CN"/>
+              </w:rPr>
+            </w:pPr>
+          </w:p>
+        </w:tc>
+        <w:tc>
+          <w:tcPr>
+            <w:tcW w:w="1383" w:type="dxa"/>
+          </w:tcPr>
+          <w:p>
+            <w:pPr>
+              <w:jc w:val="center"/>
+              <w:rPr>
+                <w:rFonts w:eastAsia="DengXian" w:hint="eastAsia"/>
+                <w:sz w:val="18"/>
+                <w:szCs w:val="18"/>
+                <w:lang w:eastAsia="zh-CN"/>
+              </w:rPr>
+            </w:pPr>
+          </w:p>
+        </w:tc>
+        <w:tc>
+          <w:tcPr>
+            <w:tcW w:w="1383" w:type="dxa"/>
+          </w:tcPr>
+          <w:p>
+            <w:pPr>
+              <w:jc w:val="center"/>
+              <w:rPr>
+                <w:rFonts w:eastAsia="DengXian" w:hint="eastAsia"/>
+                <w:sz w:val="18"/>
+                <w:szCs w:val="18"/>
+                <w:lang w:eastAsia="zh-CN"/>
+              </w:rPr>
+            </w:pPr>
+          </w:p>
+        </w:tc>
+        <w:tc>
+          <w:tcPr>
+            <w:tcW w:w="1383" w:type="dxa"/>
+          </w:tcPr>
+          <w:p>
+            <w:pPr>
+              <w:jc w:val="center"/>
+              <w:rPr>
+                <w:rFonts w:eastAsia="DengXian" w:hint="eastAsia"/>
+                <w:sz w:val="18"/>
+                <w:szCs w:val="18"/>
+                <w:lang w:eastAsia="zh-CN"/>
+              </w:rPr>
+            </w:pPr>
+          </w:p>
+        </w:tc>
+      </w:tr>
+      <w:tr>
+        <w:tc>
+          <w:tcPr>
+            <w:tcW w:w="1382" w:type="dxa"/>
+          </w:tcPr>
+          <w:p>
+            <w:pPr>
+              <w:jc w:val="center"/>
+              <w:rPr>
+                <w:rFonts w:eastAsia="DengXian" w:hint="eastAsia"/>
+                <w:b/>
+                <w:bCs/>
+                <w:sz w:val="18"/>
+                <w:szCs w:val="18"/>
+                <w:lang w:eastAsia="zh-CN"/>
+              </w:rPr>
+            </w:pPr>
+            <w:r>
+              <w:rPr>
+                <w:rFonts w:eastAsia="DengXian" w:hint="eastAsia"/>
+                <w:b/>
+                <w:bCs/>
+                <w:sz w:val="18"/>
+                <w:szCs w:val="18"/>
+                <w:lang w:eastAsia="zh-CN"/>
+              </w:rPr>
+              <w:t>10</w:t>
+            </w:r>
+          </w:p>
+        </w:tc>
+        <w:tc>
+          <w:tcPr>
+            <w:tcW w:w="1382" w:type="dxa"/>
+          </w:tcPr>
+          <w:p>
+            <w:pPr>
+              <w:jc w:val="center"/>
+              <w:rPr>
+                <w:rFonts w:eastAsia="DengXian" w:hint="eastAsia"/>
+                <w:sz w:val="18"/>
+                <w:szCs w:val="18"/>
+                <w:lang w:eastAsia="zh-CN"/>
+              </w:rPr>
+            </w:pPr>
+            <w:r>
+              <w:rPr>
+                <w:rFonts w:eastAsia="DengXian" w:hint="eastAsia"/>
+                <w:sz w:val="18"/>
+                <w:szCs w:val="18"/>
+                <w:lang w:eastAsia="zh-CN"/>
+              </w:rPr>
+              <w:t>191.45</w:t>
+            </w:r>
+          </w:p>
+        </w:tc>
+        <w:tc>
+          <w:tcPr>
+            <w:tcW w:w="1383" w:type="dxa"/>
+          </w:tcPr>
+          <w:p>
+            <w:pPr>
+              <w:jc w:val="center"/>
+              <w:rPr>
+                <w:rFonts w:eastAsia="DengXian" w:hint="eastAsia"/>
+                <w:sz w:val="18"/>
+                <w:szCs w:val="18"/>
+                <w:lang w:eastAsia="zh-CN"/>
+              </w:rPr>
+            </w:pPr>
+            <w:r>
+              <w:rPr>
+                <w:rFonts w:eastAsia="DengXian" w:hint="eastAsia"/>
+                <w:sz w:val="18"/>
+                <w:szCs w:val="18"/>
+                <w:lang w:eastAsia="zh-CN"/>
+              </w:rPr>
+              <w:t>307.32</w:t>
+            </w:r>
+          </w:p>
+        </w:tc>
+        <w:tc>
+          <w:tcPr>
+            <w:tcW w:w="1383" w:type="dxa"/>
+          </w:tcPr>
+          <w:p>
+            <w:pPr>
+              <w:jc w:val="center"/>
+              <w:rPr>
+                <w:rFonts w:eastAsia="DengXian" w:hint="eastAsia"/>
+                <w:sz w:val="18"/>
+                <w:szCs w:val="18"/>
+                <w:lang w:eastAsia="zh-CN"/>
+              </w:rPr>
+            </w:pPr>
+            <w:r>
+              <w:rPr>
+                <w:rFonts w:eastAsia="DengXian" w:hint="eastAsia"/>
+                <w:sz w:val="18"/>
+                <w:szCs w:val="18"/>
+                <w:lang w:eastAsia="zh-CN"/>
+              </w:rPr>
+              <w:t>-145.11</w:t>
+            </w:r>
+          </w:p>
+        </w:tc>
+        <w:tc>
+          <w:tcPr>
+            <w:tcW w:w="1383" w:type="dxa"/>
+          </w:tcPr>
+          <w:p>
+            <w:pPr>
+              <w:jc w:val="center"/>
+              <w:rPr>
+                <w:rFonts w:eastAsia="DengXian" w:hint="eastAsia"/>
+                <w:sz w:val="18"/>
+                <w:szCs w:val="18"/>
+                <w:lang w:eastAsia="zh-CN"/>
+              </w:rPr>
+            </w:pPr>
+            <w:r>
+              <w:rPr>
+                <w:rFonts w:eastAsia="DengXian" w:hint="eastAsia"/>
+                <w:sz w:val="18"/>
+                <w:szCs w:val="18"/>
+                <w:lang w:eastAsia="zh-CN"/>
+              </w:rPr>
+              <w:t>72.0%</w:t>
+            </w:r>
+          </w:p>
+        </w:tc>
+      </w:tr>
+      <w:tr>
+        <w:tc>
+          <w:tcPr>
+            <w:tcW w:w="1382" w:type="dxa"/>
+          </w:tcPr>
+          <w:p>
+            <w:pPr>
+              <w:jc w:val="center"/>
+              <w:rPr>
+                <w:rFonts w:eastAsia="DengXian" w:hint="eastAsia"/>
+                <w:b/>
+                <w:bCs/>
+                <w:sz w:val="18"/>
+                <w:szCs w:val="18"/>
+                <w:lang w:eastAsia="zh-CN"/>
+              </w:rPr>
+            </w:pPr>
+            <w:r>
+              <w:rPr>
+                <w:rFonts w:eastAsia="DengXian" w:hint="eastAsia"/>
+                <w:b/>
+                <w:bCs/>
+                <w:sz w:val="18"/>
+                <w:szCs w:val="18"/>
+                <w:lang w:eastAsia="zh-CN"/>
+              </w:rPr>
+              <w:t>20</w:t>
+            </w:r>
+          </w:p>
+        </w:tc>
+        <w:tc>
+          <w:tcPr>
+            <w:tcW w:w="1382" w:type="dxa"/>
+          </w:tcPr>
+          <w:p>
+            <w:pPr>
+              <w:jc w:val="center"/>
+              <w:rPr>
+                <w:rFonts w:eastAsia="DengXian" w:hint="eastAsia"/>
+                <w:sz w:val="18"/>
+                <w:szCs w:val="18"/>
+                <w:lang w:eastAsia="zh-CN"/>
+              </w:rPr>
+            </w:pPr>
+          </w:p>
+        </w:tc>
+        <w:tc>
+          <w:tcPr>
+            <w:tcW w:w="1383" w:type="dxa"/>
+          </w:tcPr>
+          <w:p>
+            <w:pPr>
+              <w:jc w:val="center"/>
+              <w:rPr>
+                <w:rFonts w:eastAsia="DengXian" w:hint="eastAsia"/>
+                <w:sz w:val="18"/>
+                <w:szCs w:val="18"/>
+                <w:lang w:eastAsia="zh-CN"/>
+              </w:rPr>
+            </w:pPr>
+          </w:p>
+        </w:tc>
+        <w:tc>
+          <w:tcPr>
+            <w:tcW w:w="1383" w:type="dxa"/>
+          </w:tcPr>
+          <w:p>
+            <w:pPr>
+              <w:jc w:val="center"/>
+              <w:rPr>
+                <w:rFonts w:eastAsia="DengXian" w:hint="eastAsia"/>
+                <w:sz w:val="18"/>
+                <w:szCs w:val="18"/>
+                <w:lang w:eastAsia="zh-CN"/>
+              </w:rPr>
+            </w:pPr>
+          </w:p>
+        </w:tc>
+        <w:tc>
+          <w:tcPr>
+            <w:tcW w:w="1383" w:type="dxa"/>
+          </w:tcPr>
+          <w:p>
+            <w:pPr>
+              <w:jc w:val="center"/>
+              <w:rPr>
+                <w:rFonts w:eastAsia="DengXian" w:hint="eastAsia"/>
+                <w:sz w:val="18"/>
+                <w:szCs w:val="18"/>
+                <w:lang w:eastAsia="zh-CN"/>
+              </w:rPr>
+            </w:pPr>
+          </w:p>
+        </w:tc>
+      </w:tr>
+    </w:tbl>
+    <w:p>
+      <w:pPr>
+        <w:rPr>
+          <w:rFonts w:eastAsia="DengXian" w:hint="eastAsia"/>
+          <w:b/>
+          <w:bCs/>
+          <w:sz w:val="28"/>
+          <w:szCs w:val="28"/>
+          <w:lang w:eastAsia="zh-CN"/>
+        </w:rPr>
+      </w:pPr>
     </w:p>
     <w:sectPr>
       <w:headerReference w:type="default" r:id="rId7"/>
@@ -1785,6 +3737,25 @@
       <w:szCs w:val="20"/>
     </w:rPr>
   </w:style>
+  <w:style w:type="table" w:styleId="af2">
+    <w:name w:val="Table Grid"/>
+    <w:basedOn w:val="a1"/>
+    <w:uiPriority w:val="39"/>
+    <w:rsid w:val="00575465"/>
+    <w:pPr>
+      <w:spacing w:after="0" w:line="240" w:lineRule="auto"/>
+    </w:pPr>
+    <w:tblPr>
+      <w:tblBorders>
+        <w:top w:val="single" w:sz="4" w:space="0" w:color="auto"/>
+        <w:left w:val="single" w:sz="4" w:space="0" w:color="auto"/>
+        <w:bottom w:val="single" w:sz="4" w:space="0" w:color="auto"/>
+        <w:right w:val="single" w:sz="4" w:space="0" w:color="auto"/>
+        <w:insideH w:val="single" w:sz="4" w:space="0" w:color="auto"/>
+        <w:insideV w:val="single" w:sz="4" w:space="0" w:color="auto"/>
+      </w:tblBorders>
+    </w:tblPr>
+  </w:style>
 </w:styles>
 </file>
 

</xml_diff>

<commit_message>
Upload the results of experiment 2
</commit_message>
<xml_diff>
--- a/Report.docx
+++ b/Report.docx
@@ -164,13 +164,23 @@
           <w:lang w:eastAsia="zh-CN"/>
         </w:rPr>
       </w:pPr>
-      <w:r>
-        <w:rPr>
-          <w:rFonts w:eastAsia="DengXian"/>
-          <w:szCs w:val="24"/>
-          <w:lang w:eastAsia="zh-CN"/>
-        </w:rPr>
-        <w:t>learning rate of 5e-4</w:t>
+      <w:proofErr w:type="gramStart"/>
+      <w:r>
+        <w:rPr>
+          <w:rFonts w:eastAsia="DengXian"/>
+          <w:szCs w:val="24"/>
+          <w:lang w:eastAsia="zh-CN"/>
+        </w:rPr>
+        <w:t>learning</w:t>
+      </w:r>
+      <w:proofErr w:type="gramEnd"/>
+      <w:r>
+        <w:rPr>
+          <w:rFonts w:eastAsia="DengXian"/>
+          <w:szCs w:val="24"/>
+          <w:lang w:eastAsia="zh-CN"/>
+        </w:rPr>
+        <w:t xml:space="preserve"> rate of 5e-4</w:t>
       </w:r>
     </w:p>
     <w:p>
@@ -1704,6 +1714,15 @@
                 <w:lang w:eastAsia="zh-CN"/>
               </w:rPr>
             </w:pPr>
+            <w:r>
+              <w:rPr>
+                <w:rFonts w:eastAsia="DengXian" w:hint="eastAsia"/>
+                <w:sz w:val="18"/>
+                <w:szCs w:val="18"/>
+                <w:lang w:eastAsia="zh-CN"/>
+              </w:rPr>
+              <w:t>163.95</w:t>
+            </w:r>
           </w:p>
         </w:tc>
         <w:tc>
@@ -1720,6 +1739,15 @@
                 <w:lang w:eastAsia="zh-CN"/>
               </w:rPr>
             </w:pPr>
+            <w:r>
+              <w:rPr>
+                <w:rFonts w:eastAsia="DengXian" w:hint="eastAsia"/>
+                <w:sz w:val="18"/>
+                <w:szCs w:val="18"/>
+                <w:lang w:eastAsia="zh-CN"/>
+              </w:rPr>
+              <w:t>293.85</w:t>
+            </w:r>
           </w:p>
         </w:tc>
         <w:tc>
@@ -1736,6 +1764,15 @@
                 <w:lang w:eastAsia="zh-CN"/>
               </w:rPr>
             </w:pPr>
+            <w:r>
+              <w:rPr>
+                <w:rFonts w:eastAsia="DengXian" w:hint="eastAsia"/>
+                <w:sz w:val="18"/>
+                <w:szCs w:val="18"/>
+                <w:lang w:eastAsia="zh-CN"/>
+              </w:rPr>
+              <w:t>-199.52</w:t>
+            </w:r>
           </w:p>
         </w:tc>
         <w:tc>
@@ -1752,6 +1789,15 @@
                 <w:lang w:eastAsia="zh-CN"/>
               </w:rPr>
             </w:pPr>
+            <w:r>
+              <w:rPr>
+                <w:rFonts w:eastAsia="DengXian" w:hint="eastAsia"/>
+                <w:sz w:val="18"/>
+                <w:szCs w:val="18"/>
+                <w:lang w:eastAsia="zh-CN"/>
+              </w:rPr>
+              <w:t>46.0%</w:t>
+            </w:r>
           </w:p>
         </w:tc>
       </w:tr>
@@ -1930,6 +1976,15 @@
                 <w:lang w:eastAsia="zh-CN"/>
               </w:rPr>
             </w:pPr>
+            <w:r>
+              <w:rPr>
+                <w:rFonts w:eastAsia="DengXian" w:hint="eastAsia"/>
+                <w:sz w:val="18"/>
+                <w:szCs w:val="18"/>
+                <w:lang w:eastAsia="zh-CN"/>
+              </w:rPr>
+              <w:t>207.58</w:t>
+            </w:r>
           </w:p>
         </w:tc>
         <w:tc>
@@ -1946,6 +2001,15 @@
                 <w:lang w:eastAsia="zh-CN"/>
               </w:rPr>
             </w:pPr>
+            <w:r>
+              <w:rPr>
+                <w:rFonts w:eastAsia="DengXian" w:hint="eastAsia"/>
+                <w:sz w:val="18"/>
+                <w:szCs w:val="18"/>
+                <w:lang w:eastAsia="zh-CN"/>
+              </w:rPr>
+              <w:t>310.21</w:t>
+            </w:r>
           </w:p>
         </w:tc>
         <w:tc>
@@ -1962,6 +2026,15 @@
                 <w:lang w:eastAsia="zh-CN"/>
               </w:rPr>
             </w:pPr>
+            <w:r>
+              <w:rPr>
+                <w:rFonts w:eastAsia="DengXian" w:hint="eastAsia"/>
+                <w:sz w:val="18"/>
+                <w:szCs w:val="18"/>
+                <w:lang w:eastAsia="zh-CN"/>
+              </w:rPr>
+              <w:t>-511.00</w:t>
+            </w:r>
           </w:p>
         </w:tc>
         <w:tc>
@@ -1978,6 +2051,15 @@
                 <w:lang w:eastAsia="zh-CN"/>
               </w:rPr>
             </w:pPr>
+            <w:r>
+              <w:rPr>
+                <w:rFonts w:eastAsia="DengXian" w:hint="eastAsia"/>
+                <w:sz w:val="18"/>
+                <w:szCs w:val="18"/>
+                <w:lang w:eastAsia="zh-CN"/>
+              </w:rPr>
+              <w:t>79.0%</w:t>
+            </w:r>
           </w:p>
         </w:tc>
       </w:tr>
@@ -1986,13 +2068,65 @@
       <w:pPr>
         <w:rPr>
           <w:rFonts w:eastAsia="DengXian" w:hint="eastAsia"/>
-          <w:b/>
-          <w:bCs/>
-          <w:sz w:val="28"/>
-          <w:szCs w:val="28"/>
+          <w:szCs w:val="24"/>
           <w:lang w:eastAsia="zh-CN"/>
         </w:rPr>
       </w:pPr>
+      <w:r>
+        <w:rPr>
+          <w:rFonts w:eastAsia="DengXian"/>
+          <w:szCs w:val="24"/>
+          <w:lang w:eastAsia="zh-CN"/>
+        </w:rPr>
+        <w:t>The results show that the learning rate also affected the DQN agent’s performance. Among the tested values, 1e-3 achieved the best result, with the highest mean reward of 207.58 and the highest success rate of 79.0%. This suggests that a larger learning rate helped the model update its Q-values more effectively during training.</w:t>
+      </w:r>
+      <w:r>
+        <w:t xml:space="preserve"> </w:t>
+      </w:r>
+      <w:r>
+        <w:rPr>
+          <w:rFonts w:eastAsia="DengXian"/>
+          <w:szCs w:val="24"/>
+          <w:lang w:eastAsia="zh-CN"/>
+        </w:rPr>
+        <w:t xml:space="preserve">In contrast, </w:t>
+      </w:r>
+      <w:proofErr w:type="gramStart"/>
+      <w:r>
+        <w:rPr>
+          <w:rFonts w:eastAsia="DengXian"/>
+          <w:szCs w:val="24"/>
+          <w:lang w:eastAsia="zh-CN"/>
+        </w:rPr>
+        <w:t>1e</w:t>
+      </w:r>
+      <w:proofErr w:type="gramEnd"/>
+      <w:r>
+        <w:rPr>
+          <w:rFonts w:eastAsia="DengXian"/>
+          <w:szCs w:val="24"/>
+          <w:lang w:eastAsia="zh-CN"/>
+        </w:rPr>
+        <w:t xml:space="preserve">-4 performed worse, with only 46.0% success rate, suggesting that the learning rate was too </w:t>
+      </w:r>
+      <w:proofErr w:type="gramStart"/>
+      <w:r>
+        <w:rPr>
+          <w:rFonts w:eastAsia="DengXian"/>
+          <w:szCs w:val="24"/>
+          <w:lang w:eastAsia="zh-CN"/>
+        </w:rPr>
+        <w:t>small</w:t>
+      </w:r>
+      <w:proofErr w:type="gramEnd"/>
+      <w:r>
+        <w:rPr>
+          <w:rFonts w:eastAsia="DengXian"/>
+          <w:szCs w:val="24"/>
+          <w:lang w:eastAsia="zh-CN"/>
+        </w:rPr>
+        <w:t xml:space="preserve"> and the agent learned more slowly.</w:t>
+      </w:r>
     </w:p>
     <w:p>
       <w:pPr>

</xml_diff>

<commit_message>
Upload the file of experiment 3 and README.md
</commit_message>
<xml_diff>
--- a/Report.docx
+++ b/Report.docx
@@ -2394,6 +2394,15 @@
                 <w:lang w:eastAsia="zh-CN"/>
               </w:rPr>
             </w:pPr>
+            <w:r>
+              <w:rPr>
+                <w:rFonts w:eastAsia="DengXian" w:hint="eastAsia"/>
+                <w:sz w:val="18"/>
+                <w:szCs w:val="18"/>
+                <w:lang w:eastAsia="zh-CN"/>
+              </w:rPr>
+              <w:t>159.61</w:t>
+            </w:r>
           </w:p>
         </w:tc>
         <w:tc>
@@ -2410,6 +2419,15 @@
                 <w:lang w:eastAsia="zh-CN"/>
               </w:rPr>
             </w:pPr>
+            <w:r>
+              <w:rPr>
+                <w:rFonts w:eastAsia="DengXian" w:hint="eastAsia"/>
+                <w:sz w:val="18"/>
+                <w:szCs w:val="18"/>
+                <w:lang w:eastAsia="zh-CN"/>
+              </w:rPr>
+              <w:t>305.23</w:t>
+            </w:r>
           </w:p>
         </w:tc>
         <w:tc>
@@ -2426,6 +2444,15 @@
                 <w:lang w:eastAsia="zh-CN"/>
               </w:rPr>
             </w:pPr>
+            <w:r>
+              <w:rPr>
+                <w:rFonts w:eastAsia="DengXian" w:hint="eastAsia"/>
+                <w:sz w:val="18"/>
+                <w:szCs w:val="18"/>
+                <w:lang w:eastAsia="zh-CN"/>
+              </w:rPr>
+              <w:t>-17.12</w:t>
+            </w:r>
           </w:p>
         </w:tc>
         <w:tc>
@@ -2442,6 +2469,15 @@
                 <w:lang w:eastAsia="zh-CN"/>
               </w:rPr>
             </w:pPr>
+            <w:r>
+              <w:rPr>
+                <w:rFonts w:eastAsia="DengXian" w:hint="eastAsia"/>
+                <w:sz w:val="18"/>
+                <w:szCs w:val="18"/>
+                <w:lang w:eastAsia="zh-CN"/>
+              </w:rPr>
+              <w:t>47.0%</w:t>
+            </w:r>
           </w:p>
         </w:tc>
       </w:tr>
@@ -2675,11 +2711,93 @@
     <w:p>
       <w:pPr>
         <w:rPr>
+          <w:rFonts w:eastAsia="DengXian"/>
+          <w:szCs w:val="24"/>
+          <w:lang w:eastAsia="zh-CN"/>
+        </w:rPr>
+      </w:pPr>
+    </w:p>
+    <w:p>
+      <w:pPr>
+        <w:rPr>
+          <w:rFonts w:eastAsia="DengXian"/>
+          <w:szCs w:val="24"/>
+          <w:lang w:eastAsia="zh-CN"/>
+        </w:rPr>
+      </w:pPr>
+      <w:r>
+        <w:rPr>
+          <w:rFonts w:eastAsia="DengXian"/>
+          <w:szCs w:val="24"/>
+          <w:lang w:eastAsia="zh-CN"/>
+        </w:rPr>
+        <w:t xml:space="preserve">For the complete project, </w:t>
+      </w:r>
+      <w:r>
+        <w:rPr>
+          <w:rFonts w:eastAsia="DengXian"/>
+          <w:szCs w:val="24"/>
+          <w:lang w:eastAsia="zh-CN"/>
+        </w:rPr>
+        <w:t>I</w:t>
+      </w:r>
+      <w:r>
+        <w:rPr>
           <w:rFonts w:eastAsia="DengXian" w:hint="eastAsia"/>
-          <w:b/>
-          <w:bCs/>
-          <w:sz w:val="28"/>
-          <w:szCs w:val="28"/>
+          <w:szCs w:val="24"/>
+          <w:lang w:eastAsia="zh-CN"/>
+        </w:rPr>
+        <w:t xml:space="preserve"> had </w:t>
+      </w:r>
+      <w:proofErr w:type="gramStart"/>
+      <w:r>
+        <w:rPr>
+          <w:rFonts w:eastAsia="DengXian" w:hint="eastAsia"/>
+          <w:szCs w:val="24"/>
+          <w:lang w:eastAsia="zh-CN"/>
+        </w:rPr>
+        <w:t>upload</w:t>
+      </w:r>
+      <w:proofErr w:type="gramEnd"/>
+      <w:r>
+        <w:rPr>
+          <w:rFonts w:eastAsia="DengXian" w:hint="eastAsia"/>
+          <w:szCs w:val="24"/>
+          <w:lang w:eastAsia="zh-CN"/>
+        </w:rPr>
+        <w:t xml:space="preserve"> the whole file on </w:t>
+      </w:r>
+      <w:r>
+        <w:rPr>
+          <w:rFonts w:eastAsia="DengXian"/>
+          <w:szCs w:val="24"/>
+          <w:lang w:eastAsia="zh-CN"/>
+        </w:rPr>
+        <w:t>GitHub</w:t>
+      </w:r>
+      <w:r>
+        <w:rPr>
+          <w:rFonts w:eastAsia="DengXian" w:hint="eastAsia"/>
+          <w:szCs w:val="24"/>
+          <w:lang w:eastAsia="zh-CN"/>
+        </w:rPr>
+        <w:t>:</w:t>
+      </w:r>
+    </w:p>
+    <w:p>
+      <w:pPr>
+        <w:rPr>
+          <w:rFonts w:eastAsia="DengXian" w:hint="eastAsia"/>
+          <w:szCs w:val="24"/>
+          <w:lang w:eastAsia="zh-CN"/>
+        </w:rPr>
+      </w:pPr>
+    </w:p>
+    <w:p>
+      <w:pPr>
+        <w:rPr>
+          <w:rFonts w:eastAsia="DengXian" w:hint="eastAsia"/>
+          <w:szCs w:val="24"/>
           <w:lang w:eastAsia="zh-CN"/>
         </w:rPr>
       </w:pPr>

</xml_diff>